<commit_message>
Made the first set of table notes
</commit_message>
<xml_diff>
--- a/docs/meetings/notes for 24 nov 2025.docx
+++ b/docs/meetings/notes for 24 nov 2025.docx
@@ -4,18 +4,2735 @@
   <w:body>
     <w:p>
       <w:pPr>
+        <w:pStyle w:val="Heading1"/>
+      </w:pPr>
+      <w:r>
+        <w:t xml:space="preserve">CSO Placement </w:t>
+      </w:r>
+    </w:p>
+    <w:p>
+      <w:pPr>
+        <w:rPr>
+          <w:rFonts w:ascii="Arial" w:hAnsi="Arial" w:cs="Arial"/>
+        </w:rPr>
+      </w:pPr>
+    </w:p>
+    <w:p>
+      <w:pPr>
+        <w:pStyle w:val="Heading2"/>
+      </w:pPr>
+      <w:r>
+        <w:t>Important features</w:t>
+      </w:r>
+    </w:p>
+    <w:p>
+      <w:pPr>
+        <w:rPr>
+          <w:rFonts w:ascii="Arial" w:hAnsi="Arial" w:cs="Arial"/>
+        </w:rPr>
+      </w:pPr>
+      <w:r>
+        <w:rPr>
+          <w:rFonts w:ascii="Arial" w:hAnsi="Arial" w:cs="Arial"/>
+        </w:rPr>
+        <w:t xml:space="preserve">Spills are persistent </w:t>
+      </w:r>
+      <w:r>
+        <w:rPr>
+          <w:rFonts w:ascii="Arial" w:hAnsi="Arial" w:cs="Arial"/>
+        </w:rPr>
+        <w:sym w:font="Wingdings" w:char="F0E0"/>
+      </w:r>
+      <w:r>
+        <w:rPr>
+          <w:rFonts w:ascii="Arial" w:hAnsi="Arial" w:cs="Arial"/>
+        </w:rPr>
+        <w:t xml:space="preserve"> rules out rainfall </w:t>
+      </w:r>
+      <w:r>
+        <w:rPr>
+          <w:rFonts w:ascii="Arial" w:hAnsi="Arial" w:cs="Arial"/>
+        </w:rPr>
+        <w:t>shock variations</w:t>
+      </w:r>
+      <w:r>
+        <w:rPr>
+          <w:rFonts w:ascii="Arial" w:hAnsi="Arial" w:cs="Arial"/>
+        </w:rPr>
+        <w:t xml:space="preserve"> </w:t>
+      </w:r>
+    </w:p>
+    <w:p>
+      <w:pPr>
+        <w:rPr>
+          <w:rFonts w:ascii="Arial" w:hAnsi="Arial" w:cs="Arial"/>
+        </w:rPr>
+      </w:pPr>
+      <w:r>
+        <w:rPr>
+          <w:rFonts w:ascii="Arial" w:hAnsi="Arial" w:cs="Arial"/>
+        </w:rPr>
+        <w:t xml:space="preserve">Spills are larger than anyone knew </w:t>
+      </w:r>
+      <w:r>
+        <w:rPr>
+          <w:rFonts w:ascii="Arial" w:hAnsi="Arial" w:cs="Arial"/>
+        </w:rPr>
+        <w:sym w:font="Wingdings" w:char="F0E0"/>
+      </w:r>
+      <w:r>
+        <w:rPr>
+          <w:rFonts w:ascii="Arial" w:hAnsi="Arial" w:cs="Arial"/>
+        </w:rPr>
+        <w:t xml:space="preserve"> information value in CSO rollout</w:t>
+      </w:r>
+    </w:p>
+    <w:p>
+      <w:pPr>
+        <w:rPr>
+          <w:rFonts w:ascii="Arial" w:hAnsi="Arial" w:cs="Arial"/>
+        </w:rPr>
+      </w:pPr>
+    </w:p>
+    <w:p>
+      <w:pPr>
+        <w:pStyle w:val="Heading2"/>
+      </w:pPr>
+      <w:r>
+        <w:t>Potential instruments</w:t>
+      </w:r>
+      <w:r>
+        <w:t xml:space="preserve"> for CSO placement</w:t>
+      </w:r>
+    </w:p>
+    <w:p>
+      <w:pPr>
+        <w:pStyle w:val="ListParagraph"/>
+        <w:numPr>
+          <w:ilvl w:val="0"/>
+          <w:numId w:val="21"/>
+        </w:numPr>
+        <w:rPr>
+          <w:rFonts w:ascii="Arial" w:hAnsi="Arial" w:cs="Arial"/>
+        </w:rPr>
+      </w:pPr>
+      <w:r>
         <w:rPr>
           <w:rFonts w:ascii="Arial" w:hAnsi="Arial" w:cs="Arial"/>
           <w:b/>
           <w:bCs/>
         </w:rPr>
-      </w:pPr>
+        <w:t xml:space="preserve">Rollout of </w:t>
+      </w:r>
       <w:r>
         <w:rPr>
           <w:rFonts w:ascii="Arial" w:hAnsi="Arial" w:cs="Arial"/>
           <w:b/>
           <w:bCs/>
         </w:rPr>
+        <w:t>EDM</w:t>
+      </w:r>
+      <w:r>
+        <w:rPr>
+          <w:rFonts w:ascii="Arial" w:hAnsi="Arial" w:cs="Arial"/>
+          <w:b/>
+          <w:bCs/>
+        </w:rPr>
+        <w:t>s</w:t>
+      </w:r>
+      <w:r>
+        <w:rPr>
+          <w:rFonts w:ascii="Arial" w:hAnsi="Arial" w:cs="Arial"/>
+        </w:rPr>
+        <w:t xml:space="preserve"> </w:t>
+      </w:r>
+    </w:p>
+    <w:p>
+      <w:pPr>
+        <w:rPr>
+          <w:rFonts w:ascii="Arial" w:hAnsi="Arial" w:cs="Arial"/>
+        </w:rPr>
+      </w:pPr>
+      <w:r>
+        <w:rPr>
+          <w:rFonts w:ascii="Arial" w:hAnsi="Arial" w:cs="Arial"/>
+        </w:rPr>
+        <w:t>N</w:t>
+      </w:r>
+      <w:r>
+        <w:rPr>
+          <w:rFonts w:ascii="Arial" w:hAnsi="Arial" w:cs="Arial"/>
+        </w:rPr>
+        <w:t xml:space="preserve">on-random rollout </w:t>
+      </w:r>
+      <w:r>
+        <w:rPr>
+          <w:rFonts w:ascii="Arial" w:hAnsi="Arial" w:cs="Arial"/>
+        </w:rPr>
+        <w:t>prioritising</w:t>
+      </w:r>
+      <w:r>
+        <w:rPr>
+          <w:rFonts w:ascii="Arial" w:hAnsi="Arial" w:cs="Arial"/>
+        </w:rPr>
+        <w:t xml:space="preserve"> sensitive sites like bathing waters and SSSIs, so need to rule out </w:t>
+      </w:r>
+      <w:r>
+        <w:rPr>
+          <w:rFonts w:ascii="Arial" w:hAnsi="Arial" w:cs="Arial"/>
+        </w:rPr>
+        <w:t>desirability through local area fixed effects and show parallel trends across late v early and possibly falsify where pressure groups were located. Observed spills affected by EDM activation and other factors, add news stories if possible at local level</w:t>
+      </w:r>
+    </w:p>
+    <w:p>
+      <w:pPr>
+        <w:rPr>
+          <w:rFonts w:ascii="Arial" w:hAnsi="Arial" w:cs="Arial"/>
+        </w:rPr>
+      </w:pPr>
+    </w:p>
+    <w:p>
+      <w:pPr>
+        <w:pStyle w:val="ListParagraph"/>
+        <w:numPr>
+          <w:ilvl w:val="0"/>
+          <w:numId w:val="21"/>
+        </w:numPr>
+        <w:rPr>
+          <w:rFonts w:ascii="Arial" w:hAnsi="Arial" w:cs="Arial"/>
+        </w:rPr>
+      </w:pPr>
+      <w:r>
+        <w:rPr>
+          <w:rFonts w:ascii="Arial" w:hAnsi="Arial" w:cs="Arial"/>
+          <w:b/>
+          <w:bCs/>
+        </w:rPr>
+        <w:t>Geological</w:t>
+      </w:r>
+      <w:r>
+        <w:rPr>
+          <w:rFonts w:ascii="Arial" w:hAnsi="Arial" w:cs="Arial"/>
+          <w:b/>
+          <w:bCs/>
+        </w:rPr>
+        <w:t>/natural geographical</w:t>
+      </w:r>
+      <w:r>
+        <w:rPr>
+          <w:rFonts w:ascii="Arial" w:hAnsi="Arial" w:cs="Arial"/>
+          <w:b/>
+          <w:bCs/>
+        </w:rPr>
+        <w:t xml:space="preserve"> </w:t>
+      </w:r>
+      <w:r>
+        <w:rPr>
+          <w:rFonts w:ascii="Arial" w:hAnsi="Arial" w:cs="Arial"/>
+          <w:b/>
+          <w:bCs/>
+        </w:rPr>
+        <w:t>features</w:t>
+      </w:r>
+      <w:r>
+        <w:rPr>
+          <w:rFonts w:ascii="Arial" w:hAnsi="Arial" w:cs="Arial"/>
+        </w:rPr>
+        <w:t xml:space="preserve"> </w:t>
+      </w:r>
+    </w:p>
+    <w:p>
+      <w:pPr>
+        <w:rPr>
+          <w:rFonts w:ascii="Arial" w:hAnsi="Arial" w:cs="Arial"/>
+        </w:rPr>
+      </w:pPr>
+      <w:r>
+        <w:rPr>
+          <w:rFonts w:ascii="Arial" w:hAnsi="Arial" w:cs="Arial"/>
+        </w:rPr>
+        <w:t xml:space="preserve">Catchment slope, Soil infiltration capacity and Drainage density. </w:t>
+      </w:r>
+    </w:p>
+    <w:p>
+      <w:pPr>
+        <w:rPr>
+          <w:rFonts w:ascii="Arial" w:hAnsi="Arial" w:cs="Arial"/>
+        </w:rPr>
+      </w:pPr>
+      <w:r>
+        <w:rPr>
+          <w:rFonts w:ascii="Arial" w:hAnsi="Arial" w:cs="Arial"/>
+        </w:rPr>
+        <w:t>Downstream v upstream of CSOs</w:t>
+      </w:r>
+      <w:r>
+        <w:rPr>
+          <w:rFonts w:ascii="Arial" w:hAnsi="Arial" w:cs="Arial"/>
+        </w:rPr>
+        <w:t xml:space="preserve"> (need elevation and water flow maps)</w:t>
+      </w:r>
+      <w:r>
+        <w:rPr>
+          <w:rFonts w:ascii="Arial" w:hAnsi="Arial" w:cs="Arial"/>
+        </w:rPr>
+        <w:t>. Per</w:t>
+      </w:r>
+      <w:r>
+        <w:rPr>
+          <w:rFonts w:ascii="Arial" w:hAnsi="Arial" w:cs="Arial"/>
+        </w:rPr>
+        <w:t>rmeability of soil</w:t>
+      </w:r>
+      <w:r>
+        <w:rPr>
+          <w:rFonts w:ascii="Arial" w:hAnsi="Arial" w:cs="Arial"/>
+        </w:rPr>
+        <w:t xml:space="preserve"> so how much absorbed</w:t>
+      </w:r>
+      <w:r>
+        <w:rPr>
+          <w:rFonts w:ascii="Arial" w:hAnsi="Arial" w:cs="Arial"/>
+        </w:rPr>
+        <w:t xml:space="preserve">. </w:t>
+      </w:r>
+      <w:r>
+        <w:rPr>
+          <w:rFonts w:ascii="Arial" w:hAnsi="Arial" w:cs="Arial"/>
+        </w:rPr>
+        <w:t xml:space="preserve">Drainage density of </w:t>
+      </w:r>
+      <w:r>
+        <w:rPr>
+          <w:rFonts w:ascii="Arial" w:hAnsi="Arial" w:cs="Arial"/>
+          <w:color w:val="0F1115"/>
+          <w:shd w:val="clear" w:color="auto" w:fill="FFFFFF"/>
+        </w:rPr>
+        <w:t>how many tributaries the sewer system had to consolidate</w:t>
+      </w:r>
+      <w:r>
+        <w:rPr>
+          <w:rFonts w:ascii="Arial" w:hAnsi="Arial" w:cs="Arial"/>
+          <w:color w:val="0F1115"/>
+          <w:shd w:val="clear" w:color="auto" w:fill="FFFFFF"/>
+        </w:rPr>
+        <w:t>.</w:t>
+      </w:r>
+      <w:r>
+        <w:rPr>
+          <w:rFonts w:ascii="Arial" w:hAnsi="Arial" w:cs="Arial"/>
+        </w:rPr>
+        <w:t xml:space="preserve"> </w:t>
+      </w:r>
+      <w:r>
+        <w:rPr>
+          <w:rFonts w:ascii="Arial" w:hAnsi="Arial" w:cs="Arial"/>
+        </w:rPr>
+        <w:t>Predicted spills more likely in downstream locations or in areas with upstream impermeable land</w:t>
+      </w:r>
+      <w:r>
+        <w:rPr>
+          <w:rFonts w:ascii="Arial" w:hAnsi="Arial" w:cs="Arial"/>
+        </w:rPr>
+        <w:t xml:space="preserve"> or more network junctions</w:t>
+      </w:r>
+      <w:r>
+        <w:rPr>
+          <w:rFonts w:ascii="Arial" w:hAnsi="Arial" w:cs="Arial"/>
+        </w:rPr>
+        <w:t xml:space="preserve">. </w:t>
+      </w:r>
+    </w:p>
+    <w:p>
+      <w:pPr>
+        <w:rPr>
+          <w:rFonts w:ascii="Arial" w:hAnsi="Arial" w:cs="Arial"/>
+        </w:rPr>
+      </w:pPr>
+    </w:p>
+    <w:p>
+      <w:pPr>
+        <w:pStyle w:val="ListParagraph"/>
+        <w:numPr>
+          <w:ilvl w:val="0"/>
+          <w:numId w:val="21"/>
+        </w:numPr>
+        <w:rPr>
+          <w:rFonts w:ascii="Arial" w:hAnsi="Arial" w:cs="Arial"/>
+        </w:rPr>
+      </w:pPr>
+      <w:r>
+        <w:rPr>
+          <w:rFonts w:ascii="Arial" w:hAnsi="Arial" w:cs="Arial"/>
+          <w:b/>
+          <w:bCs/>
+        </w:rPr>
+        <w:t>Historic h</w:t>
+      </w:r>
+      <w:r>
+        <w:rPr>
+          <w:rFonts w:ascii="Arial" w:hAnsi="Arial" w:cs="Arial"/>
+          <w:b/>
+          <w:bCs/>
+        </w:rPr>
+        <w:t xml:space="preserve">ydraulic </w:t>
+      </w:r>
+      <w:r>
+        <w:rPr>
+          <w:rFonts w:ascii="Arial" w:hAnsi="Arial" w:cs="Arial"/>
+          <w:b/>
+          <w:bCs/>
+        </w:rPr>
+        <w:t>features</w:t>
+      </w:r>
+      <w:r>
+        <w:rPr>
+          <w:rFonts w:ascii="Arial" w:hAnsi="Arial" w:cs="Arial"/>
+        </w:rPr>
+        <w:t xml:space="preserve"> </w:t>
+      </w:r>
+    </w:p>
+    <w:p>
+      <w:pPr>
+        <w:rPr>
+          <w:rFonts w:ascii="Arial" w:hAnsi="Arial" w:cs="Arial"/>
+          <w:b/>
+          <w:bCs/>
+        </w:rPr>
+      </w:pPr>
+    </w:p>
+    <w:p>
+      <w:pPr>
+        <w:rPr>
+          <w:rFonts w:ascii="Arial" w:hAnsi="Arial" w:cs="Arial"/>
+          <w:b/>
+          <w:bCs/>
+        </w:rPr>
+      </w:pPr>
+      <w:r>
+        <w:rPr>
+          <w:rFonts w:ascii="Arial" w:hAnsi="Arial" w:cs="Arial"/>
+          <w:b/>
+          <w:bCs/>
+        </w:rPr>
+        <w:t>Treatment Plants</w:t>
+      </w:r>
+    </w:p>
+    <w:p>
+      <w:pPr>
+        <w:rPr>
+          <w:rFonts w:ascii="Arial" w:hAnsi="Arial" w:cs="Arial"/>
+        </w:rPr>
+      </w:pPr>
+      <w:r>
+        <w:rPr>
+          <w:rFonts w:ascii="Arial" w:hAnsi="Arial" w:cs="Arial"/>
+        </w:rPr>
+        <w:t>H</w:t>
+      </w:r>
+      <w:r>
+        <w:rPr>
+          <w:rFonts w:ascii="Arial" w:hAnsi="Arial" w:cs="Arial"/>
+        </w:rPr>
+        <w:t>istorically determined and highly persistent</w:t>
+      </w:r>
+      <w:r>
+        <w:rPr>
+          <w:rFonts w:ascii="Arial" w:hAnsi="Arial" w:cs="Arial"/>
+        </w:rPr>
+        <w:t>. And they</w:t>
+      </w:r>
+      <w:r>
+        <w:rPr>
+          <w:rFonts w:ascii="Arial" w:hAnsi="Arial" w:cs="Arial"/>
+        </w:rPr>
+        <w:t xml:space="preserve"> anchor drainage direction of catchment areas</w:t>
+      </w:r>
+      <w:r>
+        <w:rPr>
+          <w:rFonts w:ascii="Arial" w:hAnsi="Arial" w:cs="Arial"/>
+        </w:rPr>
+        <w:t xml:space="preserve">. </w:t>
+      </w:r>
+    </w:p>
+    <w:p>
+      <w:pPr>
+        <w:rPr>
+          <w:rFonts w:ascii="Arial" w:hAnsi="Arial" w:cs="Arial"/>
+          <w:b/>
+          <w:bCs/>
+        </w:rPr>
+      </w:pPr>
+    </w:p>
+    <w:p>
+      <w:pPr>
+        <w:pStyle w:val="ListParagraph"/>
+        <w:numPr>
+          <w:ilvl w:val="0"/>
+          <w:numId w:val="22"/>
+        </w:numPr>
+        <w:rPr>
+          <w:rFonts w:ascii="Arial" w:hAnsi="Arial" w:cs="Arial"/>
+        </w:rPr>
+      </w:pPr>
+      <w:r>
+        <w:rPr>
+          <w:rFonts w:ascii="Arial" w:hAnsi="Arial" w:cs="Arial"/>
+          <w:b/>
+          <w:bCs/>
+        </w:rPr>
+        <w:t>Distance to water works treatment plants</w:t>
+      </w:r>
+      <w:r>
+        <w:rPr>
+          <w:rFonts w:ascii="Arial" w:hAnsi="Arial" w:cs="Arial"/>
+        </w:rPr>
+        <w:t xml:space="preserve"> </w:t>
+      </w:r>
+      <w:r>
+        <w:sym w:font="Wingdings" w:char="F0DF"/>
+      </w:r>
+      <w:r>
+        <w:rPr>
+          <w:rFonts w:ascii="Arial" w:hAnsi="Arial" w:cs="Arial"/>
+        </w:rPr>
+        <w:t xml:space="preserve"> </w:t>
+      </w:r>
+      <w:r>
+        <w:rPr>
+          <w:rFonts w:ascii="Arial" w:hAnsi="Arial" w:cs="Arial"/>
+        </w:rPr>
+        <w:t>explains pressure on system but not where it spills</w:t>
+      </w:r>
+      <w:r>
+        <w:rPr>
+          <w:rFonts w:ascii="Arial" w:hAnsi="Arial" w:cs="Arial"/>
+        </w:rPr>
+        <w:t xml:space="preserve">. </w:t>
+      </w:r>
+      <w:r>
+        <w:rPr>
+          <w:rFonts w:ascii="Arial" w:hAnsi="Arial" w:cs="Arial"/>
+        </w:rPr>
+        <w:t>C</w:t>
+      </w:r>
+      <w:r>
+        <w:rPr>
+          <w:rFonts w:ascii="Arial" w:hAnsi="Arial" w:cs="Arial"/>
+        </w:rPr>
+        <w:t xml:space="preserve">ould be </w:t>
+      </w:r>
+      <w:r>
+        <w:rPr>
+          <w:rFonts w:ascii="Arial" w:hAnsi="Arial" w:cs="Arial"/>
+        </w:rPr>
+        <w:t>sited near industry so downstream areas may have historic trajectories</w:t>
+      </w:r>
+      <w:r>
+        <w:rPr>
+          <w:rFonts w:ascii="Arial" w:hAnsi="Arial" w:cs="Arial"/>
+        </w:rPr>
+        <w:t xml:space="preserve">. </w:t>
+      </w:r>
+    </w:p>
+    <w:p>
+      <w:pPr>
+        <w:pStyle w:val="ListParagraph"/>
+        <w:numPr>
+          <w:ilvl w:val="0"/>
+          <w:numId w:val="22"/>
+        </w:numPr>
+        <w:rPr>
+          <w:rFonts w:ascii="Arial" w:hAnsi="Arial" w:cs="Arial"/>
+        </w:rPr>
+      </w:pPr>
+      <w:r>
+        <w:rPr>
+          <w:rFonts w:ascii="Arial" w:hAnsi="Arial" w:cs="Arial"/>
+          <w:b/>
+          <w:bCs/>
+        </w:rPr>
+        <w:t>C</w:t>
+      </w:r>
+      <w:r>
+        <w:rPr>
+          <w:rFonts w:ascii="Arial" w:hAnsi="Arial" w:cs="Arial"/>
+          <w:b/>
+          <w:bCs/>
+        </w:rPr>
+        <w:t xml:space="preserve">losures </w:t>
+      </w:r>
+      <w:r>
+        <w:rPr>
+          <w:rFonts w:ascii="Arial" w:hAnsi="Arial" w:cs="Arial"/>
+          <w:b/>
+          <w:bCs/>
+        </w:rPr>
+        <w:t>of treatment plants</w:t>
+      </w:r>
+      <w:r>
+        <w:rPr>
+          <w:rFonts w:ascii="Arial" w:hAnsi="Arial" w:cs="Arial"/>
+        </w:rPr>
+        <w:t xml:space="preserve"> </w:t>
+      </w:r>
+      <w:r>
+        <w:sym w:font="Wingdings" w:char="F0DF"/>
+      </w:r>
+      <w:r>
+        <w:rPr>
+          <w:rFonts w:ascii="Arial" w:hAnsi="Arial" w:cs="Arial"/>
+        </w:rPr>
+        <w:t xml:space="preserve"> may have arisen </w:t>
+      </w:r>
+      <w:r>
+        <w:rPr>
+          <w:rFonts w:ascii="Arial" w:hAnsi="Arial" w:cs="Arial"/>
+        </w:rPr>
+        <w:t>due to pollution concerns</w:t>
+      </w:r>
+      <w:r>
+        <w:rPr>
+          <w:rFonts w:ascii="Arial" w:hAnsi="Arial" w:cs="Arial"/>
+        </w:rPr>
+        <w:t xml:space="preserve"> but this should not affect where pressure relief is mechanically required in the system (instead affects where treatment eventually occurs but will change route). More affected by closures when have low elevation within catchment (Stream Portal has maps), have capacity constraints and downstream tailwater conditions </w:t>
+      </w:r>
+    </w:p>
+    <w:p>
+      <w:pPr>
+        <w:pStyle w:val="ListParagraph"/>
+        <w:numPr>
+          <w:ilvl w:val="0"/>
+          <w:numId w:val="22"/>
+        </w:numPr>
+        <w:rPr>
+          <w:rFonts w:ascii="Arial" w:hAnsi="Arial" w:cs="Arial"/>
+        </w:rPr>
+      </w:pPr>
+      <w:r>
+        <w:rPr>
+          <w:rFonts w:ascii="Arial" w:hAnsi="Arial" w:cs="Arial"/>
+          <w:b/>
+          <w:bCs/>
+        </w:rPr>
+        <w:t xml:space="preserve">Upgrades </w:t>
+      </w:r>
+      <w:r>
+        <w:sym w:font="Wingdings" w:char="F0DF"/>
+      </w:r>
+      <w:r>
+        <w:rPr>
+          <w:rFonts w:ascii="Arial" w:hAnsi="Arial" w:cs="Arial"/>
+        </w:rPr>
+        <w:t xml:space="preserve"> </w:t>
+      </w:r>
+      <w:r>
+        <w:rPr>
+          <w:rFonts w:ascii="Arial" w:hAnsi="Arial" w:cs="Arial"/>
+        </w:rPr>
+        <w:t>CSOs upstream of Lee Tunnel vs downstream / outside catchment in 2016, South-bank CSOs draining to Crossness vs others in 2012-16, Deephams catchment vs adjacent catchments in 2011-17,</w:t>
+      </w:r>
+      <w:r>
+        <w:rPr>
+          <w:rFonts w:ascii="Arial" w:hAnsi="Arial" w:cs="Arial"/>
+        </w:rPr>
+        <w:t xml:space="preserve"> Thames Tideway Tunnel</w:t>
+      </w:r>
+      <w:r>
+        <w:rPr>
+          <w:rFonts w:ascii="Arial" w:hAnsi="Arial" w:cs="Arial"/>
+        </w:rPr>
+        <w:t xml:space="preserve"> ongoing. </w:t>
+      </w:r>
+      <w:r>
+        <w:rPr>
+          <w:rFonts w:ascii="Arial" w:hAnsi="Arial" w:cs="Arial"/>
+          <w:color w:val="0F1115"/>
+          <w:shd w:val="clear" w:color="auto" w:fill="FFFFFF"/>
+        </w:rPr>
+        <w:t>Discrete, large-scale interventions that reduce spill frequency for specific CSO catchments.</w:t>
+      </w:r>
+      <w:r>
+        <w:rPr>
+          <w:rFonts w:ascii="Arial" w:hAnsi="Arial" w:cs="Arial"/>
+          <w:color w:val="0F1115"/>
+          <w:shd w:val="clear" w:color="auto" w:fill="FFFFFF"/>
+        </w:rPr>
+        <w:t xml:space="preserve"> </w:t>
+      </w:r>
+      <w:r>
+        <w:rPr>
+          <w:rFonts w:ascii="Arial" w:hAnsi="Arial" w:cs="Arial"/>
+          <w:color w:val="0F1115"/>
+          <w:shd w:val="clear" w:color="auto" w:fill="FFFFFF"/>
+        </w:rPr>
+        <w:t>Upgrade timing/location is determined by system-wide engineering and regulatory planning, not local price trends.</w:t>
+      </w:r>
+    </w:p>
+    <w:p>
+      <w:pPr>
+        <w:rPr>
+          <w:rFonts w:ascii="Arial" w:hAnsi="Arial" w:cs="Arial"/>
+        </w:rPr>
+      </w:pPr>
+    </w:p>
+    <w:p>
+      <w:pPr>
+        <w:rPr>
+          <w:rFonts w:ascii="Arial" w:hAnsi="Arial" w:cs="Arial"/>
+        </w:rPr>
+      </w:pPr>
+      <w:r>
+        <w:rPr>
+          <w:rFonts w:ascii="Arial" w:hAnsi="Arial" w:cs="Arial"/>
+          <w:b/>
+          <w:bCs/>
+        </w:rPr>
+        <w:lastRenderedPageBreak/>
+        <w:t>H</w:t>
+      </w:r>
+      <w:r>
+        <w:rPr>
+          <w:rFonts w:ascii="Arial" w:hAnsi="Arial" w:cs="Arial"/>
+          <w:b/>
+          <w:bCs/>
+        </w:rPr>
+        <w:t>istoric h</w:t>
+      </w:r>
+      <w:r>
+        <w:rPr>
+          <w:rFonts w:ascii="Arial" w:hAnsi="Arial" w:cs="Arial"/>
+          <w:b/>
+          <w:bCs/>
+        </w:rPr>
+        <w:t>ydraulic</w:t>
+      </w:r>
+      <w:r>
+        <w:rPr>
+          <w:rFonts w:ascii="Arial" w:hAnsi="Arial" w:cs="Arial"/>
+          <w:b/>
+          <w:bCs/>
+        </w:rPr>
+        <w:t xml:space="preserve"> engineering</w:t>
+      </w:r>
+      <w:r>
+        <w:rPr>
+          <w:rFonts w:ascii="Arial" w:hAnsi="Arial" w:cs="Arial"/>
+          <w:b/>
+          <w:bCs/>
+        </w:rPr>
+        <w:t xml:space="preserve"> design</w:t>
+      </w:r>
+    </w:p>
+    <w:p>
+      <w:pPr>
+        <w:rPr>
+          <w:rFonts w:ascii="Arial" w:hAnsi="Arial" w:cs="Arial"/>
+        </w:rPr>
+      </w:pPr>
+      <w:r>
+        <w:rPr>
+          <w:rFonts w:ascii="Arial" w:hAnsi="Arial" w:cs="Arial"/>
+        </w:rPr>
+        <w:t xml:space="preserve">Historical lock-in as the system </w:t>
+      </w:r>
+      <w:r>
+        <w:rPr>
+          <w:rFonts w:ascii="Arial" w:hAnsi="Arial" w:cs="Arial"/>
+        </w:rPr>
+        <w:t>and its</w:t>
+      </w:r>
+      <w:r>
+        <w:rPr>
+          <w:rFonts w:ascii="Arial" w:hAnsi="Arial" w:cs="Arial"/>
+        </w:rPr>
+        <w:t xml:space="preserve"> pinch points for spillage are inherited. </w:t>
+      </w:r>
+    </w:p>
+    <w:p>
+      <w:pPr>
+        <w:rPr>
+          <w:rFonts w:ascii="Arial" w:hAnsi="Arial" w:cs="Arial"/>
+        </w:rPr>
+      </w:pPr>
+    </w:p>
+    <w:p>
+      <w:pPr>
+        <w:pStyle w:val="ListParagraph"/>
+        <w:numPr>
+          <w:ilvl w:val="0"/>
+          <w:numId w:val="19"/>
+        </w:numPr>
+        <w:rPr>
+          <w:rFonts w:ascii="Arial" w:hAnsi="Arial" w:cs="Arial"/>
+          <w:b/>
+          <w:bCs/>
+        </w:rPr>
+      </w:pPr>
+      <w:r>
+        <w:rPr>
+          <w:rFonts w:ascii="Arial" w:hAnsi="Arial" w:cs="Arial"/>
+          <w:b/>
+          <w:bCs/>
+        </w:rPr>
+        <w:t>Deviations of Sewer Path</w:t>
+      </w:r>
+      <w:r>
+        <w:rPr>
+          <w:rFonts w:ascii="Arial" w:hAnsi="Arial" w:cs="Arial"/>
+          <w:b/>
+          <w:bCs/>
+        </w:rPr>
+        <w:t xml:space="preserve"> from Shortest Distance</w:t>
+      </w:r>
+    </w:p>
+    <w:p>
+      <w:pPr>
+        <w:rPr>
+          <w:rFonts w:ascii="Arial" w:hAnsi="Arial" w:cs="Arial"/>
+          <w:color w:val="0F1115"/>
+          <w:shd w:val="clear" w:color="auto" w:fill="FFFFFF"/>
+        </w:rPr>
+      </w:pPr>
+      <w:r>
+        <w:rPr>
+          <w:rFonts w:ascii="Arial" w:hAnsi="Arial" w:cs="Arial"/>
+        </w:rPr>
+        <w:t>C</w:t>
+      </w:r>
+      <w:r>
+        <w:rPr>
+          <w:rFonts w:ascii="Arial" w:hAnsi="Arial" w:cs="Arial"/>
+          <w:color w:val="0F1115"/>
+          <w:shd w:val="clear" w:color="auto" w:fill="FFFFFF"/>
+        </w:rPr>
+        <w:t xml:space="preserve">hosen sewer path often deviated from the hydrological ideal to avoid expensive land acquisition, </w:t>
+      </w:r>
+      <w:r>
+        <w:rPr>
+          <w:rFonts w:ascii="Arial" w:hAnsi="Arial" w:cs="Arial"/>
+          <w:color w:val="0F1115"/>
+          <w:shd w:val="clear" w:color="auto" w:fill="FFFFFF"/>
+        </w:rPr>
+        <w:t>tunnelling</w:t>
+      </w:r>
+      <w:r>
+        <w:rPr>
+          <w:rFonts w:ascii="Arial" w:hAnsi="Arial" w:cs="Arial"/>
+          <w:color w:val="0F1115"/>
+          <w:shd w:val="clear" w:color="auto" w:fill="FFFFFF"/>
+        </w:rPr>
+        <w:t>, or crossing obstacles</w:t>
+      </w:r>
+      <w:r>
+        <w:rPr>
+          <w:rFonts w:ascii="Arial" w:hAnsi="Arial" w:cs="Arial"/>
+          <w:color w:val="0F1115"/>
+          <w:shd w:val="clear" w:color="auto" w:fill="FFFFFF"/>
+        </w:rPr>
+        <w:t xml:space="preserve">. </w:t>
+      </w:r>
+    </w:p>
+    <w:p>
+      <w:pPr>
+        <w:rPr>
+          <w:rFonts w:ascii="Arial" w:hAnsi="Arial" w:cs="Arial"/>
+          <w:color w:val="0F1115"/>
+          <w:shd w:val="clear" w:color="auto" w:fill="FFFFFF"/>
+        </w:rPr>
+      </w:pPr>
+    </w:p>
+    <w:p>
+      <w:pPr>
+        <w:rPr>
+          <w:rFonts w:ascii="Arial" w:hAnsi="Arial" w:cs="Arial"/>
+          <w:color w:val="0F1115"/>
+          <w:shd w:val="clear" w:color="auto" w:fill="FFFFFF"/>
+        </w:rPr>
+      </w:pPr>
+      <w:r>
+        <w:rPr>
+          <w:rFonts w:ascii="Arial" w:hAnsi="Arial" w:cs="Arial"/>
+          <w:color w:val="0F1115"/>
+          <w:shd w:val="clear" w:color="auto" w:fill="FFFFFF"/>
+        </w:rPr>
+        <w:t>For a given CSO or sewer segment, calculate the</w:t>
+      </w:r>
+      <w:r>
+        <w:rPr>
+          <w:rFonts w:ascii="Arial" w:hAnsi="Arial" w:cs="Arial"/>
+          <w:color w:val="0F1115"/>
+          <w:shd w:val="clear" w:color="auto" w:fill="FFFFFF"/>
+        </w:rPr>
+        <w:t xml:space="preserve"> ratio of actual length to straight line distance </w:t>
+      </w:r>
+      <w:r>
+        <w:rPr>
+          <w:rFonts w:ascii="Arial" w:hAnsi="Arial" w:cs="Arial"/>
+          <w:color w:val="0F1115"/>
+          <w:shd w:val="clear" w:color="auto" w:fill="FFFFFF"/>
+        </w:rPr>
+        <w:t>between its start and end points. A higher ratio indicates a more circuitous, potentially cost-constrained route</w:t>
+      </w:r>
+      <w:r>
+        <w:rPr>
+          <w:rFonts w:ascii="Arial" w:hAnsi="Arial" w:cs="Arial"/>
+          <w:color w:val="0F1115"/>
+          <w:shd w:val="clear" w:color="auto" w:fill="FFFFFF"/>
+        </w:rPr>
+        <w:t xml:space="preserve"> that </w:t>
+      </w:r>
+      <w:r>
+        <w:rPr>
+          <w:rFonts w:ascii="Arial" w:hAnsi="Arial" w:cs="Arial"/>
+          <w:color w:val="0F1115"/>
+          <w:shd w:val="clear" w:color="auto" w:fill="FFFFFF"/>
+        </w:rPr>
+        <w:t>could lead to suboptimal hydraulic performance (e.g., slower flow, more frequent blockages/surcharge) in the modern system, contributing to spill frequency.</w:t>
+      </w:r>
+      <w:r>
+        <w:rPr>
+          <w:rFonts w:ascii="Arial" w:hAnsi="Arial" w:cs="Arial"/>
+          <w:color w:val="0F1115"/>
+          <w:shd w:val="clear" w:color="auto" w:fill="FFFFFF"/>
+        </w:rPr>
+        <w:t xml:space="preserve"> Flatter gradient, pumped section, pipe diameter, upstream population (London used census data), upstream number of major tributary junctions per mile of sewer</w:t>
+      </w:r>
+      <w:r>
+        <w:rPr>
+          <w:rFonts w:ascii="Arial" w:hAnsi="Arial" w:cs="Arial"/>
+          <w:color w:val="0F1115"/>
+          <w:shd w:val="clear" w:color="auto" w:fill="FFFFFF"/>
+        </w:rPr>
+        <w:t xml:space="preserve"> (more on these in 2).</w:t>
+      </w:r>
+    </w:p>
+    <w:p>
+      <w:pPr>
+        <w:rPr>
+          <w:rFonts w:ascii="Arial" w:hAnsi="Arial" w:cs="Arial"/>
+          <w:color w:val="0F1115"/>
+          <w:shd w:val="clear" w:color="auto" w:fill="FFFFFF"/>
+        </w:rPr>
+      </w:pPr>
+    </w:p>
+    <w:p>
+      <w:pPr>
+        <w:rPr>
+          <w:rFonts w:ascii="Arial" w:hAnsi="Arial" w:cs="Arial"/>
+          <w:color w:val="0F1115"/>
+          <w:shd w:val="clear" w:color="auto" w:fill="FFFFFF"/>
+        </w:rPr>
+      </w:pPr>
+      <w:r>
+        <w:rPr>
+          <w:rFonts w:ascii="Arial" w:hAnsi="Arial" w:cs="Arial"/>
+          <w:color w:val="0F1115"/>
+          <w:shd w:val="clear" w:color="auto" w:fill="FFFFFF"/>
+        </w:rPr>
+        <w:t>What can be</w:t>
+      </w:r>
+      <w:r>
+        <w:rPr>
+          <w:rFonts w:ascii="Arial" w:hAnsi="Arial" w:cs="Arial"/>
+          <w:color w:val="0F1115"/>
+          <w:shd w:val="clear" w:color="auto" w:fill="FFFFFF"/>
+        </w:rPr>
+        <w:t xml:space="preserve"> construct</w:t>
+      </w:r>
+      <w:r>
+        <w:rPr>
+          <w:rFonts w:ascii="Arial" w:hAnsi="Arial" w:cs="Arial"/>
+          <w:color w:val="0F1115"/>
+          <w:shd w:val="clear" w:color="auto" w:fill="FFFFFF"/>
+        </w:rPr>
+        <w:t>ed</w:t>
+      </w:r>
+      <w:r>
+        <w:rPr>
+          <w:rFonts w:ascii="Arial" w:hAnsi="Arial" w:cs="Arial"/>
+          <w:color w:val="0F1115"/>
+          <w:shd w:val="clear" w:color="auto" w:fill="FFFFFF"/>
+        </w:rPr>
+        <w:t xml:space="preserve"> with existing data? Circuitousnes</w:t>
+      </w:r>
+      <w:r>
+        <w:rPr>
+          <w:rFonts w:ascii="Arial" w:hAnsi="Arial" w:cs="Arial"/>
+          <w:color w:val="0F1115"/>
+          <w:shd w:val="clear" w:color="auto" w:fill="FFFFFF"/>
+        </w:rPr>
+        <w:t>s,</w:t>
+      </w:r>
+      <w:r>
+        <w:rPr>
+          <w:rFonts w:ascii="Arial" w:hAnsi="Arial" w:cs="Arial"/>
+          <w:color w:val="0F1115"/>
+          <w:shd w:val="clear" w:color="auto" w:fill="FFFFFF"/>
+        </w:rPr>
+        <w:t xml:space="preserve"> gradient</w:t>
+      </w:r>
+      <w:r>
+        <w:rPr>
+          <w:rFonts w:ascii="Arial" w:hAnsi="Arial" w:cs="Arial"/>
+          <w:color w:val="0F1115"/>
+          <w:shd w:val="clear" w:color="auto" w:fill="FFFFFF"/>
+        </w:rPr>
+        <w:t>, population pressure</w:t>
+      </w:r>
+      <w:r>
+        <w:rPr>
+          <w:rFonts w:ascii="Arial" w:hAnsi="Arial" w:cs="Arial"/>
+          <w:color w:val="0F1115"/>
+          <w:shd w:val="clear" w:color="auto" w:fill="FFFFFF"/>
+        </w:rPr>
+        <w:t>.</w:t>
+      </w:r>
+    </w:p>
+    <w:p>
+      <w:pPr>
+        <w:rPr>
+          <w:rFonts w:ascii="Arial" w:hAnsi="Arial" w:cs="Arial"/>
+          <w:color w:val="0F1115"/>
+          <w:shd w:val="clear" w:color="auto" w:fill="FFFFFF"/>
+        </w:rPr>
+      </w:pPr>
+      <w:r>
+        <w:rPr>
+          <w:rFonts w:ascii="Arial" w:hAnsi="Arial" w:cs="Arial"/>
+          <w:color w:val="0F1115"/>
+          <w:shd w:val="clear" w:color="auto" w:fill="FFFFFF"/>
+        </w:rPr>
+        <w:t xml:space="preserve"> </w:t>
+      </w:r>
+    </w:p>
+    <w:p>
+      <w:pPr>
+        <w:rPr>
+          <w:rFonts w:ascii="Arial" w:hAnsi="Arial" w:cs="Arial"/>
+          <w:color w:val="0F1115"/>
+          <w:shd w:val="clear" w:color="auto" w:fill="FFFFFF"/>
+        </w:rPr>
+      </w:pPr>
+      <w:r>
+        <w:rPr>
+          <w:rFonts w:ascii="Arial" w:hAnsi="Arial" w:cs="Arial"/>
+          <w:b/>
+          <w:bCs/>
+          <w:color w:val="0F1115"/>
+          <w:shd w:val="clear" w:color="auto" w:fill="FFFFFF"/>
+        </w:rPr>
+        <w:t>Circuitousness</w:t>
+      </w:r>
+      <w:r>
+        <w:rPr>
+          <w:rFonts w:ascii="Arial" w:hAnsi="Arial" w:cs="Arial"/>
+          <w:color w:val="0F1115"/>
+          <w:shd w:val="clear" w:color="auto" w:fill="FFFFFF"/>
+        </w:rPr>
+        <w:t xml:space="preserve"> from t</w:t>
+      </w:r>
+      <w:r>
+        <w:rPr>
+          <w:rFonts w:ascii="Arial" w:hAnsi="Arial" w:cs="Arial"/>
+          <w:color w:val="0F1115"/>
+          <w:shd w:val="clear" w:color="auto" w:fill="FFFFFF"/>
+        </w:rPr>
+        <w:t>runk sewer</w:t>
+      </w:r>
+      <w:r>
+        <w:rPr>
+          <w:rFonts w:ascii="Arial" w:hAnsi="Arial" w:cs="Arial"/>
+          <w:color w:val="0F1115"/>
+          <w:shd w:val="clear" w:color="auto" w:fill="FFFFFF"/>
+        </w:rPr>
+        <w:t xml:space="preserve"> path</w:t>
+      </w:r>
+      <w:r>
+        <w:rPr>
+          <w:rFonts w:ascii="Arial" w:hAnsi="Arial" w:cs="Arial"/>
+          <w:color w:val="0F1115"/>
+          <w:shd w:val="clear" w:color="auto" w:fill="FFFFFF"/>
+        </w:rPr>
+        <w:t xml:space="preserve">s </w:t>
+      </w:r>
+      <w:r>
+        <w:rPr>
+          <w:rFonts w:ascii="Arial" w:hAnsi="Arial" w:cs="Arial"/>
+          <w:color w:val="0F1115"/>
+          <w:shd w:val="clear" w:color="auto" w:fill="FFFFFF"/>
+        </w:rPr>
+        <w:t xml:space="preserve">that tend to </w:t>
+      </w:r>
+      <w:r>
+        <w:rPr>
+          <w:rFonts w:ascii="Arial" w:hAnsi="Arial" w:cs="Arial"/>
+          <w:color w:val="0F1115"/>
+          <w:shd w:val="clear" w:color="auto" w:fill="FFFFFF"/>
+        </w:rPr>
+        <w:t xml:space="preserve">follow natural/buried rivers and streams (from Ordnance Survey Open Rivers and OS OpenMap Local for waterlines/course and rivers/streams). </w:t>
+      </w:r>
+    </w:p>
+    <w:p>
+      <w:pPr>
+        <w:rPr>
+          <w:rFonts w:ascii="Arial" w:hAnsi="Arial" w:cs="Arial"/>
+          <w:color w:val="0F1115"/>
+          <w:shd w:val="clear" w:color="auto" w:fill="FFFFFF"/>
+        </w:rPr>
+      </w:pPr>
+      <w:r>
+        <w:rPr>
+          <w:rFonts w:ascii="Arial" w:hAnsi="Arial" w:cs="Arial"/>
+          <w:b/>
+          <w:bCs/>
+          <w:color w:val="0F1115"/>
+          <w:shd w:val="clear" w:color="auto" w:fill="FFFFFF"/>
+        </w:rPr>
+        <w:t>Gradient</w:t>
+      </w:r>
+      <w:r>
+        <w:rPr>
+          <w:rFonts w:ascii="Arial" w:hAnsi="Arial" w:cs="Arial"/>
+          <w:b/>
+          <w:bCs/>
+          <w:color w:val="0F1115"/>
+          <w:shd w:val="clear" w:color="auto" w:fill="FFFFFF"/>
+        </w:rPr>
+        <w:t xml:space="preserve"> </w:t>
+      </w:r>
+      <w:r>
+        <w:rPr>
+          <w:rFonts w:ascii="Arial" w:hAnsi="Arial" w:cs="Arial"/>
+          <w:color w:val="0F1115"/>
+          <w:shd w:val="clear" w:color="auto" w:fill="FFFFFF"/>
+        </w:rPr>
+        <w:t xml:space="preserve">needs start and end points </w:t>
+      </w:r>
+      <w:r>
+        <w:rPr>
+          <w:rFonts w:ascii="Arial" w:hAnsi="Arial" w:cs="Arial"/>
+          <w:color w:val="0F1115"/>
+          <w:shd w:val="clear" w:color="auto" w:fill="FFFFFF"/>
+        </w:rPr>
+        <w:t>of sewer (OS Terrain 50 and LIDAR for topography)</w:t>
+      </w:r>
+    </w:p>
+    <w:p>
+      <w:pPr>
+        <w:rPr>
+          <w:rFonts w:ascii="Arial" w:hAnsi="Arial" w:cs="Arial"/>
+          <w:color w:val="0F1115"/>
+          <w:shd w:val="clear" w:color="auto" w:fill="FFFFFF"/>
+        </w:rPr>
+      </w:pPr>
+      <w:r>
+        <w:rPr>
+          <w:rFonts w:ascii="Arial" w:hAnsi="Arial" w:cs="Arial"/>
+          <w:b/>
+          <w:bCs/>
+          <w:color w:val="0F1115"/>
+          <w:shd w:val="clear" w:color="auto" w:fill="FFFFFF"/>
+        </w:rPr>
+        <w:t>Historical population</w:t>
+      </w:r>
+      <w:r>
+        <w:rPr>
+          <w:rFonts w:ascii="Arial" w:hAnsi="Arial" w:cs="Arial"/>
+          <w:color w:val="0F1115"/>
+          <w:shd w:val="clear" w:color="auto" w:fill="FFFFFF"/>
+        </w:rPr>
+        <w:t xml:space="preserve"> </w:t>
+      </w:r>
+      <w:r>
+        <w:rPr>
+          <w:rFonts w:ascii="Arial" w:hAnsi="Arial" w:cs="Arial"/>
+          <w:color w:val="0F1115"/>
+          <w:shd w:val="clear" w:color="auto" w:fill="FFFFFF"/>
+        </w:rPr>
+        <w:t xml:space="preserve">needs </w:t>
+      </w:r>
+      <w:r>
+        <w:rPr>
+          <w:rFonts w:ascii="Arial" w:hAnsi="Arial" w:cs="Arial"/>
+          <w:color w:val="0F1115"/>
+          <w:shd w:val="clear" w:color="auto" w:fill="FFFFFF"/>
+        </w:rPr>
+        <w:t>old census</w:t>
+      </w:r>
+      <w:r>
+        <w:rPr>
+          <w:rFonts w:ascii="Arial" w:hAnsi="Arial" w:cs="Arial"/>
+          <w:color w:val="0F1115"/>
+          <w:shd w:val="clear" w:color="auto" w:fill="FFFFFF"/>
+        </w:rPr>
+        <w:t>es</w:t>
+      </w:r>
+      <w:r>
+        <w:rPr>
+          <w:rFonts w:ascii="Arial" w:hAnsi="Arial" w:cs="Arial"/>
+          <w:color w:val="0F1115"/>
+          <w:shd w:val="clear" w:color="auto" w:fill="FFFFFF"/>
+        </w:rPr>
+        <w:t xml:space="preserve"> </w:t>
+      </w:r>
+      <w:r>
+        <w:rPr>
+          <w:rFonts w:ascii="Arial" w:hAnsi="Arial" w:cs="Arial"/>
+          <w:color w:val="0F1115"/>
+          <w:shd w:val="clear" w:color="auto" w:fill="FFFFFF"/>
+        </w:rPr>
+        <w:t>(</w:t>
+      </w:r>
+      <w:r>
+        <w:rPr>
+          <w:rFonts w:ascii="Arial" w:hAnsi="Arial" w:cs="Arial"/>
+          <w:color w:val="0F1115"/>
+          <w:shd w:val="clear" w:color="auto" w:fill="FFFFFF"/>
+        </w:rPr>
+        <w:t>eg Bazalgette mentions using census tracts in MBW</w:t>
+      </w:r>
+      <w:r>
+        <w:rPr>
+          <w:rFonts w:ascii="Arial" w:hAnsi="Arial" w:cs="Arial"/>
+          <w:color w:val="0F1115"/>
+          <w:shd w:val="clear" w:color="auto" w:fill="FFFFFF"/>
+        </w:rPr>
+        <w:t>) and c</w:t>
+      </w:r>
+      <w:r>
+        <w:rPr>
+          <w:rFonts w:ascii="Arial" w:hAnsi="Arial" w:cs="Arial"/>
+          <w:color w:val="0F1115"/>
+          <w:shd w:val="clear" w:color="auto" w:fill="FFFFFF"/>
+        </w:rPr>
+        <w:t xml:space="preserve">atchment boundaries </w:t>
+      </w:r>
+      <w:r>
+        <w:rPr>
+          <w:rFonts w:ascii="Arial" w:hAnsi="Arial" w:cs="Arial"/>
+          <w:color w:val="0F1115"/>
+          <w:shd w:val="clear" w:color="auto" w:fill="FFFFFF"/>
+        </w:rPr>
+        <w:t>to</w:t>
+      </w:r>
+      <w:r>
+        <w:rPr>
+          <w:rFonts w:ascii="Arial" w:hAnsi="Arial" w:cs="Arial"/>
+          <w:color w:val="0F1115"/>
+          <w:shd w:val="clear" w:color="auto" w:fill="FFFFFF"/>
+        </w:rPr>
+        <w:t xml:space="preserve"> define the area whose runoff feeds each CSO</w:t>
+      </w:r>
+    </w:p>
+    <w:p>
+      <w:pPr>
+        <w:rPr>
+          <w:rFonts w:ascii="Arial" w:hAnsi="Arial" w:cs="Arial"/>
+          <w:color w:val="0F1115"/>
+          <w:shd w:val="clear" w:color="auto" w:fill="FFFFFF"/>
+        </w:rPr>
+      </w:pPr>
+    </w:p>
+    <w:p>
+      <w:pPr>
+        <w:rPr>
+          <w:rFonts w:ascii="Arial" w:hAnsi="Arial" w:cs="Arial"/>
+          <w:color w:val="0F1115"/>
+          <w:shd w:val="clear" w:color="auto" w:fill="FFFFFF"/>
+        </w:rPr>
+      </w:pPr>
+      <w:r>
+        <w:rPr>
+          <w:rFonts w:ascii="Arial" w:hAnsi="Arial" w:cs="Arial"/>
+          <w:color w:val="0F1115"/>
+          <w:shd w:val="clear" w:color="auto" w:fill="FFFFFF"/>
+        </w:rPr>
+        <w:t xml:space="preserve">Catchment + Watercourse path </w:t>
+      </w:r>
+      <w:r>
+        <w:rPr>
+          <w:rFonts w:ascii="Arial" w:hAnsi="Arial" w:cs="Arial"/>
+          <w:color w:val="0F1115"/>
+          <w:shd w:val="clear" w:color="auto" w:fill="FFFFFF"/>
+        </w:rPr>
+        <w:sym w:font="Wingdings" w:char="F0E0"/>
+      </w:r>
+      <w:r>
+        <w:rPr>
+          <w:rFonts w:ascii="Arial" w:hAnsi="Arial" w:cs="Arial"/>
+          <w:color w:val="0F1115"/>
+          <w:shd w:val="clear" w:color="auto" w:fill="FFFFFF"/>
+        </w:rPr>
+        <w:t xml:space="preserve"> Circuitousness = Length from head of catchment to CSO versus Straight-line distance, Gradient = Start point of CSO to End point of CSO / Length of Watercourse path</w:t>
+      </w:r>
+    </w:p>
+    <w:p>
+      <w:pPr>
+        <w:rPr>
+          <w:rFonts w:ascii="Arial" w:hAnsi="Arial" w:cs="Arial"/>
+          <w:color w:val="0F1115"/>
+          <w:shd w:val="clear" w:color="auto" w:fill="FFFFFF"/>
+        </w:rPr>
+      </w:pPr>
+      <w:r>
+        <w:rPr>
+          <w:rFonts w:ascii="Arial" w:hAnsi="Arial" w:cs="Arial"/>
+          <w:color w:val="0F1115"/>
+          <w:shd w:val="clear" w:color="auto" w:fill="FFFFFF"/>
+        </w:rPr>
+        <w:t xml:space="preserve">Catchment + Historical population </w:t>
+      </w:r>
+      <w:r>
+        <w:rPr>
+          <w:rFonts w:ascii="Arial" w:hAnsi="Arial" w:cs="Arial"/>
+          <w:color w:val="0F1115"/>
+          <w:shd w:val="clear" w:color="auto" w:fill="FFFFFF"/>
+        </w:rPr>
+        <w:sym w:font="Wingdings" w:char="F0E0"/>
+      </w:r>
+      <w:r>
+        <w:rPr>
+          <w:rFonts w:ascii="Arial" w:hAnsi="Arial" w:cs="Arial"/>
+          <w:color w:val="0F1115"/>
+          <w:shd w:val="clear" w:color="auto" w:fill="FFFFFF"/>
+        </w:rPr>
+        <w:t xml:space="preserve"> Capacity Pressure = Historical Population / Catchment Area</w:t>
+      </w:r>
+    </w:p>
+    <w:p>
+      <w:pPr>
+        <w:rPr>
+          <w:rFonts w:ascii="Arial" w:hAnsi="Arial" w:cs="Arial"/>
+          <w:color w:val="0F1115"/>
+          <w:shd w:val="clear" w:color="auto" w:fill="FFFFFF"/>
+        </w:rPr>
+      </w:pPr>
+    </w:p>
+    <w:p>
+      <w:pPr>
+        <w:rPr>
+          <w:rFonts w:ascii="Arial" w:hAnsi="Arial" w:cs="Arial"/>
+          <w:color w:val="0F1115"/>
+          <w:shd w:val="clear" w:color="auto" w:fill="FFFFFF"/>
+        </w:rPr>
+      </w:pPr>
+      <w:r>
+        <w:rPr>
+          <w:rFonts w:ascii="Arial" w:hAnsi="Arial" w:cs="Arial"/>
+          <w:color w:val="0F1115"/>
+          <w:shd w:val="clear" w:color="auto" w:fill="FFFFFF"/>
+        </w:rPr>
+        <w:t>CSOs in the flat, lower Thames floodplain (e.g., Bermondsey) should have very low gradients. CSOs on the steeper slopes of North London (Hampstead) should have higher gradients. If your map looks random</w:t>
+      </w:r>
+    </w:p>
+    <w:p>
+      <w:pPr>
+        <w:rPr>
+          <w:rFonts w:ascii="Arial" w:hAnsi="Arial" w:cs="Arial"/>
+          <w:color w:val="0F1115"/>
+          <w:shd w:val="clear" w:color="auto" w:fill="FFFFFF"/>
+        </w:rPr>
+      </w:pPr>
+    </w:p>
+    <w:p>
+      <w:pPr>
+        <w:pStyle w:val="ListParagraph"/>
+        <w:numPr>
+          <w:ilvl w:val="0"/>
+          <w:numId w:val="19"/>
+        </w:numPr>
+        <w:rPr>
+          <w:rFonts w:ascii="Arial" w:hAnsi="Arial" w:cs="Arial"/>
+          <w:b/>
+          <w:bCs/>
+          <w:color w:val="0F1115"/>
+          <w:shd w:val="clear" w:color="auto" w:fill="FFFFFF"/>
+        </w:rPr>
+      </w:pPr>
+      <w:r>
+        <w:rPr>
+          <w:rFonts w:ascii="Arial" w:hAnsi="Arial" w:cs="Arial"/>
+          <w:b/>
+          <w:bCs/>
+          <w:color w:val="0F1115"/>
+          <w:shd w:val="clear" w:color="auto" w:fill="FFFFFF"/>
+        </w:rPr>
+        <w:t xml:space="preserve">Hydraulic engineering </w:t>
+      </w:r>
+      <w:r>
+        <w:rPr>
+          <w:rFonts w:ascii="Arial" w:hAnsi="Arial" w:cs="Arial"/>
+          <w:b/>
+          <w:bCs/>
+          <w:color w:val="0F1115"/>
+          <w:shd w:val="clear" w:color="auto" w:fill="FFFFFF"/>
+        </w:rPr>
+        <w:t>pinch points</w:t>
+      </w:r>
+    </w:p>
+    <w:p>
+      <w:pPr>
+        <w:rPr>
+          <w:rFonts w:ascii="Arial" w:hAnsi="Arial" w:cs="Arial"/>
+          <w:color w:val="0F1115"/>
+          <w:shd w:val="clear" w:color="auto" w:fill="FFFFFF"/>
+        </w:rPr>
+      </w:pPr>
+    </w:p>
+    <w:p>
+      <w:pPr>
+        <w:rPr>
+          <w:rFonts w:ascii="Arial" w:hAnsi="Arial" w:cs="Arial"/>
+        </w:rPr>
+      </w:pPr>
+      <w:r>
+        <w:rPr>
+          <w:rFonts w:ascii="Arial" w:hAnsi="Arial" w:cs="Arial"/>
+          <w:color w:val="0F1115"/>
+          <w:shd w:val="clear" w:color="auto" w:fill="FFFFFF"/>
+        </w:rPr>
+        <w:t>Hydraulic constraints are inherited from historical network design and affect spill probability, but are not salient to modern buyers except via spill risk.</w:t>
+      </w:r>
+    </w:p>
+    <w:p>
+      <w:pPr>
+        <w:rPr>
+          <w:rFonts w:ascii="Arial" w:hAnsi="Arial" w:cs="Arial"/>
+        </w:rPr>
+      </w:pPr>
+    </w:p>
+    <w:p>
+      <w:pPr>
+        <w:rPr>
+          <w:rFonts w:ascii="Arial" w:hAnsi="Arial" w:cs="Arial"/>
+        </w:rPr>
+      </w:pPr>
+      <w:r>
+        <w:rPr>
+          <w:rFonts w:ascii="Arial" w:hAnsi="Arial" w:cs="Arial"/>
+        </w:rPr>
+        <w:t>P</w:t>
+      </w:r>
+      <w:r>
+        <w:rPr>
+          <w:rFonts w:ascii="Arial" w:hAnsi="Arial" w:cs="Arial"/>
+        </w:rPr>
+        <w:t>ipe capacity (diameter, invert level</w:t>
+      </w:r>
+      <w:r>
+        <w:rPr>
+          <w:rFonts w:ascii="Arial" w:hAnsi="Arial" w:cs="Arial"/>
+        </w:rPr>
+        <w:t xml:space="preserve"> or depth, invert offsets</w:t>
+      </w:r>
+      <w:r>
+        <w:rPr>
+          <w:rFonts w:ascii="Arial" w:hAnsi="Arial" w:cs="Arial"/>
+        </w:rPr>
+        <w:t>, slope,</w:t>
+      </w:r>
+      <w:r>
+        <w:rPr>
+          <w:rFonts w:ascii="Arial" w:hAnsi="Arial" w:cs="Arial"/>
+        </w:rPr>
+        <w:t xml:space="preserve"> </w:t>
+      </w:r>
+      <w:r>
+        <w:rPr>
+          <w:rFonts w:ascii="Arial" w:hAnsi="Arial" w:cs="Arial"/>
+        </w:rPr>
+        <w:t>material</w:t>
+      </w:r>
+      <w:r>
+        <w:rPr>
+          <w:rFonts w:ascii="Arial" w:hAnsi="Arial" w:cs="Arial"/>
+        </w:rPr>
+        <w:t xml:space="preserve"> or </w:t>
+      </w:r>
+      <w:r>
+        <w:rPr>
+          <w:rFonts w:ascii="Arial" w:hAnsi="Arial" w:cs="Arial"/>
+        </w:rPr>
+        <w:t>roughness</w:t>
+      </w:r>
+      <w:r>
+        <w:rPr>
+          <w:rFonts w:ascii="Arial" w:hAnsi="Arial" w:cs="Arial"/>
+        </w:rPr>
+        <w:t>, trunk line class—truck sewer/secondary sewer/house lateral</w:t>
+      </w:r>
+      <w:r>
+        <w:rPr>
+          <w:rFonts w:ascii="Arial" w:hAnsi="Arial" w:cs="Arial"/>
+        </w:rPr>
+        <w:t>)</w:t>
+      </w:r>
+      <w:r>
+        <w:rPr>
+          <w:rFonts w:ascii="Arial" w:hAnsi="Arial" w:cs="Arial"/>
+        </w:rPr>
+        <w:t xml:space="preserve">. Upstream population (and potential growth), </w:t>
+      </w:r>
+      <w:r>
+        <w:rPr>
+          <w:rFonts w:ascii="Arial" w:hAnsi="Arial" w:cs="Arial"/>
+        </w:rPr>
+        <w:t>upstream impervious area, hydraulic centrality (distance to treatment works, number of upstream nodes feeding into it, capital cost (depth to sewer, high groundwater levels, certain soft and permeable soil types, riverbank conditions including tidal conditions, diversions from other utilities</w:t>
+      </w:r>
+      <w:r>
+        <w:rPr>
+          <w:rFonts w:ascii="Arial" w:hAnsi="Arial" w:cs="Arial"/>
+        </w:rPr>
+        <w:t xml:space="preserve"> and rainfall (and forecasts) were accounted for in designing the system</w:t>
+      </w:r>
+      <w:r>
+        <w:rPr>
+          <w:rFonts w:ascii="Arial" w:hAnsi="Arial" w:cs="Arial"/>
+        </w:rPr>
+        <w:t xml:space="preserve">. </w:t>
+      </w:r>
+    </w:p>
+    <w:p>
+      <w:pPr>
+        <w:rPr>
+          <w:rFonts w:ascii="Arial" w:hAnsi="Arial" w:cs="Arial"/>
+          <w:shd w:val="clear" w:color="auto" w:fill="FFFFFF"/>
+        </w:rPr>
+      </w:pPr>
+    </w:p>
+    <w:p>
+      <w:pPr>
+        <w:rPr>
+          <w:rFonts w:ascii="Arial" w:hAnsi="Arial" w:cs="Arial"/>
+        </w:rPr>
+      </w:pPr>
+      <w:r>
+        <w:rPr>
+          <w:rFonts w:ascii="Arial" w:hAnsi="Arial" w:cs="Arial"/>
+        </w:rPr>
+        <w:lastRenderedPageBreak/>
+        <w:t>What we can get from the archives?</w:t>
+      </w:r>
+    </w:p>
+    <w:p>
+      <w:pPr>
+        <w:rPr>
+          <w:rFonts w:ascii="Arial" w:hAnsi="Arial" w:cs="Arial"/>
+          <w:shd w:val="clear" w:color="auto" w:fill="FFFFFF"/>
+        </w:rPr>
+      </w:pPr>
+      <w:r>
+        <w:rPr>
+          <w:rFonts w:ascii="Arial" w:hAnsi="Arial" w:cs="Arial"/>
+        </w:rPr>
+        <w:t>H</w:t>
+      </w:r>
+      <w:r>
+        <w:rPr>
+          <w:rFonts w:ascii="Arial" w:hAnsi="Arial" w:cs="Arial"/>
+        </w:rPr>
+        <w:t xml:space="preserve">istoric drawings to obtain </w:t>
+      </w:r>
+      <w:r>
+        <w:rPr>
+          <w:rFonts w:ascii="Arial" w:hAnsi="Arial" w:cs="Arial"/>
+        </w:rPr>
+        <w:t xml:space="preserve">pipe </w:t>
+      </w:r>
+      <w:r>
+        <w:rPr>
+          <w:rStyle w:val="Strong"/>
+          <w:rFonts w:ascii="Arial" w:hAnsi="Arial" w:cs="Arial"/>
+          <w:b w:val="0"/>
+          <w:bCs w:val="0"/>
+          <w:color w:val="0F1115"/>
+          <w:shd w:val="clear" w:color="auto" w:fill="FFFFFF"/>
+        </w:rPr>
+        <w:t>diameter</w:t>
+      </w:r>
+      <w:r>
+        <w:rPr>
+          <w:rFonts w:ascii="Arial" w:hAnsi="Arial" w:cs="Arial"/>
+          <w:b/>
+          <w:bCs/>
+          <w:shd w:val="clear" w:color="auto" w:fill="FFFFFF"/>
+        </w:rPr>
+        <w:t> </w:t>
+      </w:r>
+      <w:r>
+        <w:rPr>
+          <w:rFonts w:ascii="Arial" w:hAnsi="Arial" w:cs="Arial"/>
+          <w:shd w:val="clear" w:color="auto" w:fill="FFFFFF"/>
+        </w:rPr>
+        <w:t>and </w:t>
+      </w:r>
+      <w:r>
+        <w:rPr>
+          <w:rStyle w:val="Strong"/>
+          <w:rFonts w:ascii="Arial" w:hAnsi="Arial" w:cs="Arial"/>
+          <w:b w:val="0"/>
+          <w:bCs w:val="0"/>
+          <w:color w:val="0F1115"/>
+          <w:shd w:val="clear" w:color="auto" w:fill="FFFFFF"/>
+        </w:rPr>
+        <w:t>invert levels/gradients</w:t>
+      </w:r>
+      <w:r>
+        <w:rPr>
+          <w:rFonts w:ascii="Arial" w:hAnsi="Arial" w:cs="Arial"/>
+          <w:shd w:val="clear" w:color="auto" w:fill="FFFFFF"/>
+        </w:rPr>
+        <w:t> for the </w:t>
+      </w:r>
+      <w:r>
+        <w:rPr>
+          <w:rStyle w:val="Strong"/>
+          <w:rFonts w:ascii="Arial" w:hAnsi="Arial" w:cs="Arial"/>
+          <w:b w:val="0"/>
+          <w:bCs w:val="0"/>
+          <w:color w:val="0F1115"/>
+          <w:shd w:val="clear" w:color="auto" w:fill="FFFFFF"/>
+        </w:rPr>
+        <w:t>main trunk lines</w:t>
+      </w:r>
+      <w:r>
+        <w:rPr>
+          <w:rFonts w:ascii="Arial" w:hAnsi="Arial" w:cs="Arial"/>
+          <w:shd w:val="clear" w:color="auto" w:fill="FFFFFF"/>
+        </w:rPr>
+        <w:t> (like the Northern Outfall itself</w:t>
+      </w:r>
+      <w:r>
+        <w:rPr>
+          <w:rFonts w:ascii="Arial" w:hAnsi="Arial" w:cs="Arial"/>
+          <w:shd w:val="clear" w:color="auto" w:fill="FFFFFF"/>
+        </w:rPr>
+        <w:t xml:space="preserve"> which is detailed here</w:t>
+      </w:r>
+      <w:r>
+        <w:rPr>
+          <w:rFonts w:ascii="Arial" w:hAnsi="Arial" w:cs="Arial"/>
+          <w:shd w:val="clear" w:color="auto" w:fill="FFFFFF"/>
+        </w:rPr>
+        <w:t>) and major tributaries</w:t>
+      </w:r>
+      <w:r>
+        <w:rPr>
+          <w:rFonts w:ascii="Arial" w:hAnsi="Arial" w:cs="Arial"/>
+          <w:shd w:val="clear" w:color="auto" w:fill="FFFFFF"/>
+        </w:rPr>
+        <w:t xml:space="preserve">. </w:t>
+      </w:r>
+    </w:p>
+    <w:p>
+      <w:pPr>
+        <w:rPr>
+          <w:rFonts w:ascii="Arial" w:hAnsi="Arial" w:cs="Arial"/>
+          <w:shd w:val="clear" w:color="auto" w:fill="FFFFFF"/>
+        </w:rPr>
+      </w:pPr>
+      <w:r>
+        <w:rPr>
+          <w:rFonts w:ascii="Arial" w:hAnsi="Arial" w:cs="Arial"/>
+          <w:shd w:val="clear" w:color="auto" w:fill="FFFFFF"/>
+        </w:rPr>
+        <w:t xml:space="preserve">These are in the archives and are NOT digitized (as far as I know) and a sample is in the folder labelled “lma” that has photos of the drawings of the Northern Sewer Outfall of the Thames from the Bazalgette design. </w:t>
+      </w:r>
+    </w:p>
+    <w:p>
+      <w:pPr>
+        <w:rPr>
+          <w:rFonts w:ascii="Arial" w:hAnsi="Arial" w:cs="Arial"/>
+          <w:shd w:val="clear" w:color="auto" w:fill="FFFFFF"/>
+        </w:rPr>
+      </w:pPr>
+      <w:r>
+        <w:rPr>
+          <w:rFonts w:ascii="Arial" w:hAnsi="Arial" w:cs="Arial"/>
+          <w:color w:val="0F1115"/>
+          <w:shd w:val="clear" w:color="auto" w:fill="FFFFFF"/>
+        </w:rPr>
+        <w:t>Drawings provide high-precision spatial instruments or validation checks by looking</w:t>
+      </w:r>
+      <w:r>
+        <w:rPr>
+          <w:rFonts w:ascii="Arial" w:hAnsi="Arial" w:cs="Arial"/>
+          <w:color w:val="0F1115"/>
+          <w:shd w:val="clear" w:color="auto" w:fill="FFFFFF"/>
+        </w:rPr>
+        <w:t xml:space="preserve"> for </w:t>
+      </w:r>
+      <w:r>
+        <w:rPr>
+          <w:rStyle w:val="Strong"/>
+          <w:rFonts w:ascii="Arial" w:hAnsi="Arial" w:cs="Arial"/>
+          <w:b w:val="0"/>
+          <w:bCs w:val="0"/>
+          <w:color w:val="0F1115"/>
+          <w:shd w:val="clear" w:color="auto" w:fill="FFFFFF"/>
+        </w:rPr>
+        <w:t>annotated diversions</w:t>
+      </w:r>
+      <w:r>
+        <w:rPr>
+          <w:rFonts w:ascii="Arial" w:hAnsi="Arial" w:cs="Arial"/>
+          <w:color w:val="0F1115"/>
+          <w:shd w:val="clear" w:color="auto" w:fill="FFFFFF"/>
+        </w:rPr>
+        <w:t>, changes in alignment at property lines, or notes explaining route choices</w:t>
+      </w:r>
+      <w:r>
+        <w:rPr>
+          <w:rFonts w:ascii="Arial" w:hAnsi="Arial" w:cs="Arial"/>
+          <w:color w:val="0F1115"/>
+          <w:shd w:val="clear" w:color="auto" w:fill="FFFFFF"/>
+        </w:rPr>
+        <w:t xml:space="preserve"> to</w:t>
+      </w:r>
+      <w:r>
+        <w:rPr>
+          <w:rFonts w:ascii="Arial" w:hAnsi="Arial" w:cs="Arial"/>
+          <w:color w:val="0F1115"/>
+          <w:shd w:val="clear" w:color="auto" w:fill="FFFFFF"/>
+        </w:rPr>
+        <w:t xml:space="preserve"> confirm that circuitousness is a </w:t>
+      </w:r>
+      <w:r>
+        <w:rPr>
+          <w:rStyle w:val="Strong"/>
+          <w:rFonts w:ascii="Arial" w:hAnsi="Arial" w:cs="Arial"/>
+          <w:b w:val="0"/>
+          <w:bCs w:val="0"/>
+          <w:color w:val="0F1115"/>
+          <w:shd w:val="clear" w:color="auto" w:fill="FFFFFF"/>
+        </w:rPr>
+        <w:t>cost-driven engineering compromise</w:t>
+      </w:r>
+      <w:r>
+        <w:rPr>
+          <w:rFonts w:ascii="Arial" w:hAnsi="Arial" w:cs="Arial"/>
+          <w:color w:val="0F1115"/>
+          <w:shd w:val="clear" w:color="auto" w:fill="FFFFFF"/>
+        </w:rPr>
+        <w:t>, not a marker of neighbourhood desirability.</w:t>
+      </w:r>
+    </w:p>
+    <w:p>
+      <w:pPr>
+        <w:rPr>
+          <w:rFonts w:ascii="Arial" w:hAnsi="Arial" w:cs="Arial"/>
+          <w:shd w:val="clear" w:color="auto" w:fill="FFFFFF"/>
+        </w:rPr>
+      </w:pPr>
+    </w:p>
+    <w:p>
+      <w:pPr>
+        <w:rPr>
+          <w:rFonts w:ascii="Arial" w:hAnsi="Arial" w:cs="Arial"/>
+          <w:shd w:val="clear" w:color="auto" w:fill="FFFFFF"/>
+        </w:rPr>
+      </w:pPr>
+    </w:p>
+    <w:p>
+      <w:pPr>
+        <w:rPr>
+          <w:rFonts w:ascii="Arial" w:hAnsi="Arial" w:cs="Arial"/>
+          <w:shd w:val="clear" w:color="auto" w:fill="FFFFFF"/>
+        </w:rPr>
+      </w:pPr>
+      <w:r>
+        <w:rPr>
+          <w:rFonts w:ascii="Arial" w:hAnsi="Arial" w:cs="Arial"/>
+          <w:shd w:val="clear" w:color="auto" w:fill="FFFFFF"/>
+        </w:rPr>
+        <w:t>What variables can be extracted</w:t>
+      </w:r>
+      <w:r>
+        <w:rPr>
+          <w:rFonts w:ascii="Arial" w:hAnsi="Arial" w:cs="Arial"/>
+          <w:shd w:val="clear" w:color="auto" w:fill="FFFFFF"/>
+        </w:rPr>
+        <w:t xml:space="preserve"> from the drawings</w:t>
+      </w:r>
+      <w:r>
+        <w:rPr>
+          <w:rFonts w:ascii="Arial" w:hAnsi="Arial" w:cs="Arial"/>
+          <w:shd w:val="clear" w:color="auto" w:fill="FFFFFF"/>
+        </w:rPr>
+        <w:t xml:space="preserve">? </w:t>
+      </w:r>
+    </w:p>
+    <w:p>
+      <w:pPr>
+        <w:rPr>
+          <w:rFonts w:ascii="Arial" w:hAnsi="Arial" w:cs="Arial"/>
+          <w:color w:val="0F1115"/>
+        </w:rPr>
+      </w:pPr>
+      <w:r>
+        <w:rPr>
+          <w:rFonts w:ascii="Arial" w:hAnsi="Arial" w:cs="Arial"/>
+          <w:shd w:val="clear" w:color="auto" w:fill="FFFFFF"/>
+        </w:rPr>
+        <w:t xml:space="preserve">Need to georeference from drawings (see Sheet 10). Then use </w:t>
+      </w:r>
+      <w:r>
+        <w:rPr>
+          <w:rStyle w:val="Strong"/>
+          <w:rFonts w:ascii="Arial" w:hAnsi="Arial" w:cs="Arial"/>
+          <w:b w:val="0"/>
+          <w:bCs w:val="0"/>
+          <w:color w:val="0F1115"/>
+        </w:rPr>
+        <w:t>longitudinal sections</w:t>
+      </w:r>
+      <w:r>
+        <w:rPr>
+          <w:rFonts w:ascii="Arial" w:hAnsi="Arial" w:cs="Arial"/>
+          <w:color w:val="0F1115"/>
+        </w:rPr>
+        <w:t> (elevation profiles along the sewer) and </w:t>
+      </w:r>
+      <w:r>
+        <w:rPr>
+          <w:rStyle w:val="Strong"/>
+          <w:rFonts w:ascii="Arial" w:hAnsi="Arial" w:cs="Arial"/>
+          <w:b w:val="0"/>
+          <w:bCs w:val="0"/>
+          <w:color w:val="0F1115"/>
+        </w:rPr>
+        <w:t>cross-sections</w:t>
+      </w:r>
+      <w:r>
+        <w:rPr>
+          <w:rFonts w:ascii="Arial" w:hAnsi="Arial" w:cs="Arial"/>
+          <w:color w:val="0F1115"/>
+        </w:rPr>
+        <w:t> (pipe shape and size)</w:t>
+      </w:r>
+      <w:r>
+        <w:rPr>
+          <w:rFonts w:ascii="Arial" w:hAnsi="Arial" w:cs="Arial"/>
+          <w:color w:val="0F1115"/>
+        </w:rPr>
+        <w:t xml:space="preserve"> </w:t>
+      </w:r>
+      <w:r>
+        <w:rPr>
+          <w:rFonts w:ascii="Arial" w:hAnsi="Arial" w:cs="Arial"/>
+          <w:color w:val="0F1115"/>
+        </w:rPr>
+        <w:t>to construct high-precision instruments</w:t>
+      </w:r>
+      <w:r>
+        <w:rPr>
+          <w:rFonts w:ascii="Arial" w:hAnsi="Arial" w:cs="Arial"/>
+          <w:color w:val="0F1115"/>
+        </w:rPr>
+        <w:t xml:space="preserve"> (see Sheets 14 and 6)</w:t>
+      </w:r>
+      <w:r>
+        <w:rPr>
+          <w:rFonts w:ascii="Arial" w:hAnsi="Arial" w:cs="Arial"/>
+          <w:color w:val="0F1115"/>
+        </w:rPr>
+        <w:t>:</w:t>
+      </w:r>
+    </w:p>
+    <w:p>
+      <w:pPr>
+        <w:rPr>
+          <w:rFonts w:ascii="Arial" w:hAnsi="Arial" w:cs="Arial"/>
+          <w:shd w:val="clear" w:color="auto" w:fill="FFFFFF"/>
+        </w:rPr>
+      </w:pPr>
+    </w:p>
+    <w:p>
+      <w:pPr>
+        <w:pStyle w:val="ds-markdown-paragraph"/>
+        <w:numPr>
+          <w:ilvl w:val="0"/>
+          <w:numId w:val="20"/>
+        </w:numPr>
+        <w:shd w:val="clear" w:color="auto" w:fill="FFFFFF"/>
+        <w:spacing w:before="0" w:beforeAutospacing="0" w:after="0" w:afterAutospacing="0"/>
+        <w:rPr>
+          <w:rStyle w:val="Strong"/>
+          <w:rFonts w:ascii="Arial" w:hAnsi="Arial" w:cs="Arial"/>
+          <w:b w:val="0"/>
+          <w:bCs w:val="0"/>
+          <w:color w:val="0F1115"/>
+        </w:rPr>
+      </w:pPr>
+      <w:r>
+        <w:rPr>
+          <w:rStyle w:val="Strong"/>
+          <w:rFonts w:ascii="Arial" w:eastAsiaTheme="majorEastAsia" w:hAnsi="Arial" w:cs="Arial"/>
+          <w:color w:val="0F1115"/>
+        </w:rPr>
+        <w:t xml:space="preserve">Location Cues </w:t>
+      </w:r>
+      <w:r>
+        <w:rPr>
+          <w:rStyle w:val="Strong"/>
+          <w:rFonts w:ascii="Arial" w:eastAsiaTheme="majorEastAsia" w:hAnsi="Arial" w:cs="Arial"/>
+          <w:b w:val="0"/>
+          <w:bCs w:val="0"/>
+          <w:color w:val="0F1115"/>
+        </w:rPr>
+        <w:t>(e.g., street, landmark, sewer shape)</w:t>
+      </w:r>
+    </w:p>
+    <w:p>
+      <w:pPr>
+        <w:pStyle w:val="ds-markdown-paragraph"/>
+        <w:numPr>
+          <w:ilvl w:val="0"/>
+          <w:numId w:val="20"/>
+        </w:numPr>
+        <w:shd w:val="clear" w:color="auto" w:fill="FFFFFF"/>
+        <w:spacing w:before="0" w:beforeAutospacing="0" w:after="0" w:afterAutospacing="0"/>
+        <w:rPr>
+          <w:rFonts w:ascii="Arial" w:hAnsi="Arial" w:cs="Arial"/>
+          <w:color w:val="0F1115"/>
+        </w:rPr>
+      </w:pPr>
+      <w:r>
+        <w:rPr>
+          <w:rStyle w:val="Strong"/>
+          <w:rFonts w:ascii="Arial" w:eastAsiaTheme="majorEastAsia" w:hAnsi="Arial" w:cs="Arial"/>
+          <w:color w:val="0F1115"/>
+        </w:rPr>
+        <w:t>Invert Levels</w:t>
+      </w:r>
+      <w:r>
+        <w:rPr>
+          <w:rFonts w:ascii="Arial" w:hAnsi="Arial" w:cs="Arial"/>
+          <w:color w:val="0F1115"/>
+        </w:rPr>
+        <w:t> (e.g., </w:t>
+      </w:r>
+      <w:r>
+        <w:rPr>
+          <w:rStyle w:val="HTMLCode"/>
+          <w:rFonts w:ascii="Arial" w:eastAsiaTheme="majorEastAsia" w:hAnsi="Arial" w:cs="Arial"/>
+          <w:color w:val="0F1115"/>
+          <w:sz w:val="24"/>
+          <w:szCs w:val="24"/>
+          <w:shd w:val="clear" w:color="auto" w:fill="EBEEF2"/>
+        </w:rPr>
+        <w:t>12.76</w:t>
+      </w:r>
+      <w:r>
+        <w:rPr>
+          <w:rFonts w:ascii="Arial" w:hAnsi="Arial" w:cs="Arial"/>
+          <w:color w:val="0F1115"/>
+        </w:rPr>
+        <w:t>, </w:t>
+      </w:r>
+      <w:r>
+        <w:rPr>
+          <w:rStyle w:val="HTMLCode"/>
+          <w:rFonts w:ascii="Arial" w:eastAsiaTheme="majorEastAsia" w:hAnsi="Arial" w:cs="Arial"/>
+          <w:color w:val="0F1115"/>
+          <w:sz w:val="24"/>
+          <w:szCs w:val="24"/>
+          <w:shd w:val="clear" w:color="auto" w:fill="EBEEF2"/>
+        </w:rPr>
+        <w:t>11.97</w:t>
+      </w:r>
+      <w:r>
+        <w:rPr>
+          <w:rFonts w:ascii="Arial" w:hAnsi="Arial" w:cs="Arial"/>
+          <w:color w:val="0F1115"/>
+        </w:rPr>
+        <w:t>, </w:t>
+      </w:r>
+      <w:r>
+        <w:rPr>
+          <w:rStyle w:val="HTMLCode"/>
+          <w:rFonts w:ascii="Arial" w:eastAsiaTheme="majorEastAsia" w:hAnsi="Arial" w:cs="Arial"/>
+          <w:color w:val="0F1115"/>
+          <w:sz w:val="24"/>
+          <w:szCs w:val="24"/>
+          <w:shd w:val="clear" w:color="auto" w:fill="EBEEF2"/>
+        </w:rPr>
+        <w:t>9.10</w:t>
+      </w:r>
+      <w:r>
+        <w:rPr>
+          <w:rFonts w:ascii="Arial" w:hAnsi="Arial" w:cs="Arial"/>
+          <w:color w:val="0F1115"/>
+        </w:rPr>
+        <w:t> on the drawings) –</w:t>
+      </w:r>
+      <w:r>
+        <w:rPr>
+          <w:rFonts w:ascii="Arial" w:hAnsi="Arial" w:cs="Arial"/>
+          <w:color w:val="0F1115"/>
+        </w:rPr>
+        <w:t xml:space="preserve"> </w:t>
+      </w:r>
+      <w:r>
+        <w:rPr>
+          <w:rFonts w:ascii="Arial" w:hAnsi="Arial" w:cs="Arial"/>
+          <w:color w:val="0F1115"/>
+        </w:rPr>
+        <w:t>the </w:t>
+      </w:r>
+      <w:r>
+        <w:rPr>
+          <w:rStyle w:val="Strong"/>
+          <w:rFonts w:ascii="Arial" w:eastAsiaTheme="majorEastAsia" w:hAnsi="Arial" w:cs="Arial"/>
+          <w:b w:val="0"/>
+          <w:bCs w:val="0"/>
+          <w:color w:val="0F1115"/>
+        </w:rPr>
+        <w:t>exact elevation</w:t>
+      </w:r>
+      <w:r>
+        <w:rPr>
+          <w:rFonts w:ascii="Arial" w:hAnsi="Arial" w:cs="Arial"/>
+          <w:color w:val="0F1115"/>
+        </w:rPr>
+        <w:t> of the sewer bottom at specific chainages (distances).</w:t>
+      </w:r>
+    </w:p>
+    <w:p>
+      <w:pPr>
+        <w:pStyle w:val="ds-markdown-paragraph"/>
+        <w:numPr>
+          <w:ilvl w:val="0"/>
+          <w:numId w:val="20"/>
+        </w:numPr>
+        <w:shd w:val="clear" w:color="auto" w:fill="FFFFFF"/>
+        <w:spacing w:before="0" w:beforeAutospacing="0" w:after="0" w:afterAutospacing="0"/>
+        <w:rPr>
+          <w:rFonts w:ascii="Arial" w:hAnsi="Arial" w:cs="Arial"/>
+          <w:color w:val="0F1115"/>
+        </w:rPr>
+      </w:pPr>
+      <w:r>
+        <w:rPr>
+          <w:rStyle w:val="Strong"/>
+          <w:rFonts w:ascii="Arial" w:eastAsiaTheme="majorEastAsia" w:hAnsi="Arial" w:cs="Arial"/>
+          <w:color w:val="0F1115"/>
+        </w:rPr>
+        <w:t>Gradients</w:t>
+      </w:r>
+      <w:r>
+        <w:rPr>
+          <w:rFonts w:ascii="Arial" w:hAnsi="Arial" w:cs="Arial"/>
+          <w:color w:val="0F1115"/>
+        </w:rPr>
+        <w:t> – either directly stated (e.g., </w:t>
+      </w:r>
+      <w:r>
+        <w:rPr>
+          <w:rStyle w:val="HTMLCode"/>
+          <w:rFonts w:ascii="Arial" w:eastAsiaTheme="majorEastAsia" w:hAnsi="Arial" w:cs="Arial"/>
+          <w:color w:val="0F1115"/>
+          <w:sz w:val="24"/>
+          <w:szCs w:val="24"/>
+          <w:shd w:val="clear" w:color="auto" w:fill="EBEEF2"/>
+        </w:rPr>
+        <w:t>1 in 880</w:t>
+      </w:r>
+      <w:r>
+        <w:rPr>
+          <w:rFonts w:ascii="Arial" w:hAnsi="Arial" w:cs="Arial"/>
+          <w:color w:val="0F1115"/>
+        </w:rPr>
+        <w:t>, </w:t>
+      </w:r>
+      <w:r>
+        <w:rPr>
+          <w:rStyle w:val="HTMLCode"/>
+          <w:rFonts w:ascii="Arial" w:eastAsiaTheme="majorEastAsia" w:hAnsi="Arial" w:cs="Arial"/>
+          <w:color w:val="0F1115"/>
+          <w:sz w:val="24"/>
+          <w:szCs w:val="24"/>
+          <w:shd w:val="clear" w:color="auto" w:fill="EBEEF2"/>
+        </w:rPr>
+        <w:t>1 in 1150</w:t>
+      </w:r>
+      <w:r>
+        <w:rPr>
+          <w:rFonts w:ascii="Arial" w:hAnsi="Arial" w:cs="Arial"/>
+          <w:color w:val="0F1115"/>
+        </w:rPr>
+        <w:t>) or calculable from invert levels and distances.</w:t>
+      </w:r>
+    </w:p>
+    <w:p>
+      <w:pPr>
+        <w:pStyle w:val="ds-markdown-paragraph"/>
+        <w:numPr>
+          <w:ilvl w:val="0"/>
+          <w:numId w:val="20"/>
+        </w:numPr>
+        <w:shd w:val="clear" w:color="auto" w:fill="FFFFFF"/>
+        <w:spacing w:before="0" w:beforeAutospacing="0" w:after="0" w:afterAutospacing="0"/>
+        <w:rPr>
+          <w:rFonts w:ascii="Arial" w:hAnsi="Arial" w:cs="Arial"/>
+          <w:color w:val="0F1115"/>
+        </w:rPr>
+      </w:pPr>
+      <w:r>
+        <w:rPr>
+          <w:rStyle w:val="Strong"/>
+          <w:rFonts w:ascii="Arial" w:eastAsiaTheme="majorEastAsia" w:hAnsi="Arial" w:cs="Arial"/>
+          <w:color w:val="0F1115"/>
+        </w:rPr>
+        <w:t>Pipe Dimensions</w:t>
+      </w:r>
+      <w:r>
+        <w:rPr>
+          <w:rFonts w:ascii="Arial" w:hAnsi="Arial" w:cs="Arial"/>
+          <w:color w:val="0F1115"/>
+        </w:rPr>
+        <w:t> – from cross-sections: diameters (e.g., </w:t>
+      </w:r>
+      <w:r>
+        <w:rPr>
+          <w:rStyle w:val="HTMLCode"/>
+          <w:rFonts w:ascii="Arial" w:eastAsiaTheme="majorEastAsia" w:hAnsi="Arial" w:cs="Arial"/>
+          <w:color w:val="0F1115"/>
+          <w:sz w:val="24"/>
+          <w:szCs w:val="24"/>
+          <w:shd w:val="clear" w:color="auto" w:fill="EBEEF2"/>
+        </w:rPr>
+        <w:t>4'0"</w:t>
+      </w:r>
+      <w:r>
+        <w:rPr>
+          <w:rFonts w:ascii="Arial" w:hAnsi="Arial" w:cs="Arial"/>
+          <w:color w:val="0F1115"/>
+        </w:rPr>
+        <w:t>, </w:t>
+      </w:r>
+      <w:r>
+        <w:rPr>
+          <w:rStyle w:val="HTMLCode"/>
+          <w:rFonts w:ascii="Arial" w:eastAsiaTheme="majorEastAsia" w:hAnsi="Arial" w:cs="Arial"/>
+          <w:color w:val="0F1115"/>
+          <w:sz w:val="24"/>
+          <w:szCs w:val="24"/>
+          <w:shd w:val="clear" w:color="auto" w:fill="EBEEF2"/>
+        </w:rPr>
+        <w:t>6'0"</w:t>
+      </w:r>
+      <w:r>
+        <w:rPr>
+          <w:rFonts w:ascii="Arial" w:hAnsi="Arial" w:cs="Arial"/>
+          <w:color w:val="0F1115"/>
+        </w:rPr>
+        <w:t>), egg-shaped dimensions (</w:t>
+      </w:r>
+      <w:r>
+        <w:rPr>
+          <w:rStyle w:val="HTMLCode"/>
+          <w:rFonts w:ascii="Arial" w:eastAsiaTheme="majorEastAsia" w:hAnsi="Arial" w:cs="Arial"/>
+          <w:color w:val="0F1115"/>
+          <w:sz w:val="24"/>
+          <w:szCs w:val="24"/>
+          <w:shd w:val="clear" w:color="auto" w:fill="EBEEF2"/>
+        </w:rPr>
+        <w:t>54" x 36"</w:t>
+      </w:r>
+      <w:r>
+        <w:rPr>
+          <w:rFonts w:ascii="Arial" w:hAnsi="Arial" w:cs="Arial"/>
+          <w:color w:val="0F1115"/>
+        </w:rPr>
+        <w:t>), and construction details (brick vs. concrete).</w:t>
+      </w:r>
+    </w:p>
+    <w:p>
+      <w:pPr>
+        <w:pStyle w:val="ds-markdown-paragraph"/>
+        <w:numPr>
+          <w:ilvl w:val="0"/>
+          <w:numId w:val="20"/>
+        </w:numPr>
+        <w:shd w:val="clear" w:color="auto" w:fill="FFFFFF"/>
+        <w:spacing w:before="0" w:beforeAutospacing="0" w:after="0" w:afterAutospacing="0"/>
+        <w:rPr>
+          <w:rFonts w:ascii="Arial" w:hAnsi="Arial" w:cs="Arial"/>
+          <w:color w:val="0F1115"/>
+        </w:rPr>
+      </w:pPr>
+      <w:r>
+        <w:rPr>
+          <w:rStyle w:val="Strong"/>
+          <w:rFonts w:ascii="Arial" w:eastAsiaTheme="majorEastAsia" w:hAnsi="Arial" w:cs="Arial"/>
+          <w:color w:val="0F1115"/>
+        </w:rPr>
+        <w:t>Chainage</w:t>
+      </w:r>
+      <w:r>
+        <w:rPr>
+          <w:rFonts w:ascii="Arial" w:hAnsi="Arial" w:cs="Arial"/>
+          <w:color w:val="0F1115"/>
+        </w:rPr>
+        <w:t> – distance from a starting point (e.g., </w:t>
+      </w:r>
+      <w:r>
+        <w:rPr>
+          <w:rStyle w:val="HTMLCode"/>
+          <w:rFonts w:ascii="Arial" w:eastAsiaTheme="majorEastAsia" w:hAnsi="Arial" w:cs="Arial"/>
+          <w:color w:val="0F1115"/>
+          <w:sz w:val="24"/>
+          <w:szCs w:val="24"/>
+          <w:shd w:val="clear" w:color="auto" w:fill="EBEEF2"/>
+        </w:rPr>
+        <w:t>20 Miles 30 Chains</w:t>
+      </w:r>
+      <w:r>
+        <w:rPr>
+          <w:rFonts w:ascii="Arial" w:hAnsi="Arial" w:cs="Arial"/>
+          <w:color w:val="0F1115"/>
+        </w:rPr>
+        <w:t>), allowing precise location plotting.</w:t>
+      </w:r>
+    </w:p>
+    <w:p>
+      <w:pPr>
+        <w:rPr>
+          <w:rFonts w:ascii="Arial" w:hAnsi="Arial" w:cs="Arial"/>
+          <w:shd w:val="clear" w:color="auto" w:fill="FFFFFF"/>
+        </w:rPr>
+      </w:pPr>
+      <w:r>
+        <w:rPr>
+          <w:rFonts w:ascii="Arial" w:hAnsi="Arial" w:cs="Arial"/>
+          <w:shd w:val="clear" w:color="auto" w:fill="FFFFFF"/>
+        </w:rPr>
+        <w:t>Flatter gradients, notes like “tide affected”/”backwater”, pipe shape changes, smaller pipes are all good candidates for more spills.</w:t>
+      </w:r>
+    </w:p>
+    <w:p>
+      <w:pPr>
+        <w:rPr>
+          <w:rFonts w:ascii="Arial" w:hAnsi="Arial" w:cs="Arial"/>
+          <w:shd w:val="clear" w:color="auto" w:fill="FFFFFF"/>
+        </w:rPr>
+      </w:pPr>
+    </w:p>
+    <w:p>
+      <w:pPr>
+        <w:rPr>
+          <w:rFonts w:ascii="Arial" w:hAnsi="Arial" w:cs="Arial"/>
+          <w:shd w:val="clear" w:color="auto" w:fill="FFFFFF"/>
+        </w:rPr>
+      </w:pPr>
+    </w:p>
+    <w:p>
+      <w:pPr>
+        <w:rPr>
+          <w:rFonts w:ascii="Arial" w:hAnsi="Arial" w:cs="Arial"/>
+          <w:shd w:val="clear" w:color="auto" w:fill="FFFFFF"/>
+        </w:rPr>
+      </w:pPr>
+      <w:r>
+        <w:rPr>
+          <w:rFonts w:ascii="Arial" w:hAnsi="Arial" w:cs="Arial"/>
+          <w:shd w:val="clear" w:color="auto" w:fill="FFFFFF"/>
+        </w:rPr>
+        <w:t xml:space="preserve">Scaling up? </w:t>
+      </w:r>
+    </w:p>
+    <w:p>
+      <w:pPr>
+        <w:rPr>
+          <w:rFonts w:ascii="Arial" w:hAnsi="Arial" w:cs="Arial"/>
+          <w:shd w:val="clear" w:color="auto" w:fill="FFFFFF"/>
+        </w:rPr>
+      </w:pPr>
+      <w:r>
+        <w:rPr>
+          <w:rFonts w:ascii="Arial" w:hAnsi="Arial" w:cs="Arial"/>
+          <w:shd w:val="clear" w:color="auto" w:fill="FFFFFF"/>
+        </w:rPr>
+        <w:t>Calculate the gold-standard instruments from the drawings of actual gradient and circuitousness of the sewer system to examine the validity of constructed instruments</w:t>
+      </w:r>
+      <w:r>
+        <w:rPr>
+          <w:rFonts w:ascii="Arial" w:hAnsi="Arial" w:cs="Arial"/>
+          <w:shd w:val="clear" w:color="auto" w:fill="FFFFFF"/>
+        </w:rPr>
+        <w:t xml:space="preserve"> and to optimise their weighting if needed</w:t>
+      </w:r>
+      <w:r>
+        <w:rPr>
+          <w:rFonts w:ascii="Arial" w:hAnsi="Arial" w:cs="Arial"/>
+          <w:shd w:val="clear" w:color="auto" w:fill="FFFFFF"/>
+        </w:rPr>
+        <w:t xml:space="preserve">.  </w:t>
+      </w:r>
+    </w:p>
+    <w:p>
+      <w:pPr>
+        <w:rPr>
+          <w:rFonts w:ascii="Arial" w:hAnsi="Arial" w:cs="Arial"/>
+          <w:shd w:val="clear" w:color="auto" w:fill="FFFFFF"/>
+        </w:rPr>
+      </w:pPr>
+      <w:r>
+        <w:rPr>
+          <w:rFonts w:ascii="Arial" w:hAnsi="Arial" w:cs="Arial"/>
+          <w:shd w:val="clear" w:color="auto" w:fill="FFFFFF"/>
+        </w:rPr>
+        <w:t xml:space="preserve">If assume about 2-5 CSOs in London for every mile, then the </w:t>
+      </w:r>
+      <w:r>
+        <w:rPr>
+          <w:rFonts w:ascii="Arial" w:hAnsi="Arial" w:cs="Arial"/>
+          <w:shd w:val="clear" w:color="auto" w:fill="FFFFFF"/>
+        </w:rPr>
+        <w:t xml:space="preserve">NO (Hackey to Beckton) </w:t>
+      </w:r>
+      <w:r>
+        <w:rPr>
+          <w:rFonts w:ascii="Arial" w:hAnsi="Arial" w:cs="Arial"/>
+          <w:shd w:val="clear" w:color="auto" w:fill="FFFFFF"/>
+        </w:rPr>
+        <w:t>drawings cover about 2-5 high spill risk CSOs</w:t>
+      </w:r>
+    </w:p>
+    <w:p>
+      <w:pPr>
+        <w:rPr>
+          <w:rFonts w:ascii="Arial" w:hAnsi="Arial" w:cs="Arial"/>
+          <w:shd w:val="clear" w:color="auto" w:fill="FFFFFF"/>
+        </w:rPr>
+      </w:pPr>
+      <w:r>
+        <w:rPr>
+          <w:rFonts w:ascii="Arial" w:hAnsi="Arial" w:cs="Arial"/>
+          <w:shd w:val="clear" w:color="auto" w:fill="FFFFFF"/>
+        </w:rPr>
+        <w:t>Can target a purposive sample</w:t>
+      </w:r>
+      <w:r>
+        <w:rPr>
+          <w:rFonts w:ascii="Arial" w:hAnsi="Arial" w:cs="Arial"/>
+          <w:shd w:val="clear" w:color="auto" w:fill="FFFFFF"/>
+        </w:rPr>
+        <w:t xml:space="preserve"> </w:t>
+      </w:r>
+      <w:r>
+        <w:rPr>
+          <w:rFonts w:ascii="Arial" w:hAnsi="Arial" w:cs="Arial"/>
+          <w:shd w:val="clear" w:color="auto" w:fill="FFFFFF"/>
+        </w:rPr>
+        <w:t xml:space="preserve"> of key hydraulic variation segments – flat, steep, major junction, circuitous, typical urban main sewer, extreme hydraulic headroom like a pumping station inlet</w:t>
+      </w:r>
+    </w:p>
+    <w:p>
+      <w:pPr>
+        <w:rPr>
+          <w:rFonts w:ascii="Arial" w:hAnsi="Arial" w:cs="Arial"/>
+          <w:shd w:val="clear" w:color="auto" w:fill="FFFFFF"/>
+        </w:rPr>
+      </w:pPr>
+      <w:r>
+        <w:rPr>
+          <w:rFonts w:ascii="Arial" w:hAnsi="Arial" w:cs="Arial"/>
+          <w:shd w:val="clear" w:color="auto" w:fill="FFFFFF"/>
+        </w:rPr>
+        <w:t>Possible</w:t>
+      </w:r>
+      <w:r>
+        <w:rPr>
+          <w:rFonts w:ascii="Arial" w:hAnsi="Arial" w:cs="Arial"/>
+          <w:shd w:val="clear" w:color="auto" w:fill="FFFFFF"/>
+        </w:rPr>
+        <w:t xml:space="preserve"> candidates are – Beckton NO (flat), Hampstead (steep), Fleet Street (major junction), Crossness/Deptford/Abbey Mills (pumping station) </w:t>
+      </w:r>
+    </w:p>
+    <w:p>
+      <w:pPr>
+        <w:rPr>
+          <w:rFonts w:ascii="Arial" w:hAnsi="Arial" w:cs="Arial"/>
+          <w:shd w:val="clear" w:color="auto" w:fill="FFFFFF"/>
+        </w:rPr>
+      </w:pPr>
+    </w:p>
+    <w:p/>
+    <w:p>
+      <w:pPr>
+        <w:pStyle w:val="NormalWeb"/>
+        <w:shd w:val="clear" w:color="auto" w:fill="F9F9FB"/>
+        <w:spacing w:before="0" w:beforeAutospacing="0" w:after="300" w:afterAutospacing="0"/>
+        <w:sectPr>
+          <w:pgSz w:w="11906" w:h="16838"/>
+          <w:pgMar w:top="1440" w:right="1440" w:bottom="1440" w:left="1440" w:header="708" w:footer="708" w:gutter="0"/>
+          <w:cols w:space="708"/>
+          <w:docGrid w:linePitch="360"/>
+        </w:sectPr>
+      </w:pPr>
+    </w:p>
+    <w:p>
+      <w:pPr>
+        <w:pStyle w:val="NormalWeb"/>
+        <w:shd w:val="clear" w:color="auto" w:fill="F9F9FB"/>
+        <w:spacing w:before="0" w:beforeAutospacing="0" w:after="300" w:afterAutospacing="0"/>
+        <w:rPr>
+          <w:rFonts w:ascii="Montserrat" w:hAnsi="Montserrat"/>
+          <w:color w:val="434549"/>
+          <w:spacing w:val="4"/>
+        </w:rPr>
+      </w:pPr>
+      <w:r>
+        <w:lastRenderedPageBreak/>
+        <w:fldChar w:fldCharType="begin"/>
+      </w:r>
+      <w:r>
+        <w:instrText xml:space="preserve"> INCLUDEPICTURE "https://www.drainageconsultantsltd.co.uk/wp-content/uploads/2025/04/Drainage-Gradients-Falls3.jpg" \* MERGEFORMATINET </w:instrText>
+      </w:r>
+      <w:r>
+        <w:fldChar w:fldCharType="separate"/>
+      </w:r>
+      <w:r>
+        <w:rPr>
+          <w:noProof/>
+        </w:rPr>
+        <w:drawing>
+          <wp:inline distT="0" distB="0" distL="0" distR="0" wp14:anchorId="7DCAC093" wp14:editId="3A0439E8">
+            <wp:extent cx="2258256" cy="1630017"/>
+            <wp:effectExtent l="0" t="0" r="2540" b="0"/>
+            <wp:docPr id="687416381" name="Picture 1" descr="Diagram of a diagram of a pipe&#10;&#10;AI-generated content may be incorrect."/>
+            <wp:cNvGraphicFramePr>
+              <a:graphicFrameLocks xmlns:a="http://schemas.openxmlformats.org/drawingml/2006/main" noChangeAspect="1"/>
+            </wp:cNvGraphicFramePr>
+            <a:graphic xmlns:a="http://schemas.openxmlformats.org/drawingml/2006/main">
+              <a:graphicData uri="http://schemas.openxmlformats.org/drawingml/2006/picture">
+                <pic:pic xmlns:pic="http://schemas.openxmlformats.org/drawingml/2006/picture">
+                  <pic:nvPicPr>
+                    <pic:cNvPr id="687416381" name="Picture 1" descr="Diagram of a diagram of a pipe&#10;&#10;AI-generated content may be incorrect."/>
+                    <pic:cNvPicPr>
+                      <a:picLocks noChangeAspect="1" noChangeArrowheads="1"/>
+                    </pic:cNvPicPr>
+                  </pic:nvPicPr>
+                  <pic:blipFill>
+                    <a:blip r:embed="rId5" cstate="print">
+                      <a:extLst>
+                        <a:ext uri="{28A0092B-C50C-407E-A947-70E740481C1C}">
+                          <a14:useLocalDpi xmlns:a14="http://schemas.microsoft.com/office/drawing/2010/main" val="0"/>
+                        </a:ext>
+                      </a:extLst>
+                    </a:blip>
+                    <a:srcRect/>
+                    <a:stretch>
+                      <a:fillRect/>
+                    </a:stretch>
+                  </pic:blipFill>
+                  <pic:spPr bwMode="auto">
+                    <a:xfrm>
+                      <a:off x="0" y="0"/>
+                      <a:ext cx="2327447" cy="1679960"/>
+                    </a:xfrm>
+                    <a:prstGeom prst="rect">
+                      <a:avLst/>
+                    </a:prstGeom>
+                    <a:noFill/>
+                    <a:ln>
+                      <a:noFill/>
+                    </a:ln>
+                  </pic:spPr>
+                </pic:pic>
+              </a:graphicData>
+            </a:graphic>
+          </wp:inline>
+        </w:drawing>
+      </w:r>
+      <w:r>
+        <w:fldChar w:fldCharType="end"/>
+      </w:r>
+      <w:r>
+        <w:rPr>
+          <w:rFonts w:ascii="Montserrat" w:hAnsi="Montserrat"/>
+          <w:color w:val="434549"/>
+          <w:spacing w:val="4"/>
+        </w:rPr>
+        <w:t xml:space="preserve"> </w:t>
+      </w:r>
+    </w:p>
+    <w:p>
+      <w:pPr>
+        <w:pStyle w:val="NormalWeb"/>
+        <w:shd w:val="clear" w:color="auto" w:fill="F9F9FB"/>
+        <w:spacing w:before="0" w:beforeAutospacing="0" w:after="300" w:afterAutospacing="0"/>
+        <w:rPr>
+          <w:rFonts w:ascii="Montserrat" w:hAnsi="Montserrat"/>
+          <w:color w:val="434549"/>
+          <w:spacing w:val="4"/>
+          <w:sz w:val="20"/>
+          <w:szCs w:val="20"/>
+        </w:rPr>
+      </w:pPr>
+      <w:r>
+        <w:rPr>
+          <w:rFonts w:ascii="Montserrat" w:hAnsi="Montserrat"/>
+          <w:color w:val="434549"/>
+          <w:spacing w:val="4"/>
+          <w:sz w:val="20"/>
+          <w:szCs w:val="20"/>
+        </w:rPr>
+        <w:t>The invert level of a pipe is the level taken from the bottom of the inside of the pipe as shown.</w:t>
+      </w:r>
+    </w:p>
+    <w:p>
+      <w:pPr>
+        <w:pStyle w:val="NormalWeb"/>
+        <w:shd w:val="clear" w:color="auto" w:fill="F9F9FB"/>
+        <w:spacing w:before="0" w:beforeAutospacing="0" w:after="300" w:afterAutospacing="0"/>
+        <w:rPr>
+          <w:rFonts w:ascii="Montserrat" w:hAnsi="Montserrat"/>
+          <w:color w:val="434549"/>
+          <w:spacing w:val="4"/>
+          <w:sz w:val="20"/>
+          <w:szCs w:val="20"/>
+        </w:rPr>
+        <w:sectPr>
+          <w:type w:val="continuous"/>
+          <w:pgSz w:w="11906" w:h="16838"/>
+          <w:pgMar w:top="1440" w:right="1440" w:bottom="1440" w:left="1440" w:header="708" w:footer="708" w:gutter="0"/>
+          <w:cols w:num="2" w:space="708"/>
+          <w:docGrid w:linePitch="360"/>
+        </w:sectPr>
+      </w:pPr>
+      <w:r>
+        <w:rPr>
+          <w:rFonts w:ascii="Montserrat" w:hAnsi="Montserrat"/>
+          <w:color w:val="434549"/>
+          <w:spacing w:val="4"/>
+          <w:sz w:val="20"/>
+          <w:szCs w:val="20"/>
+        </w:rPr>
+        <w:t>The level at the crown of the pipe = the invert level + internal diameter of the pipe + pipe wall thickness. It may be necessary to use this in calculations when level measurements are taken from the crown of a pipe</w:t>
+      </w:r>
+      <w:r>
+        <w:rPr>
+          <w:rFonts w:ascii="Montserrat" w:hAnsi="Montserrat"/>
+          <w:color w:val="434549"/>
+          <w:spacing w:val="4"/>
+          <w:sz w:val="20"/>
+          <w:szCs w:val="20"/>
+        </w:rPr>
+        <w:t>.</w:t>
+      </w:r>
+    </w:p>
+    <w:p>
+      <w:pPr>
+        <w:rPr>
+          <w:rFonts w:ascii="Arial" w:hAnsi="Arial" w:cs="Arial"/>
+        </w:rPr>
+        <w:sectPr>
+          <w:type w:val="continuous"/>
+          <w:pgSz w:w="11906" w:h="16838"/>
+          <w:pgMar w:top="1440" w:right="1440" w:bottom="1440" w:left="1440" w:header="708" w:footer="708" w:gutter="0"/>
+          <w:cols w:space="708"/>
+          <w:docGrid w:linePitch="360"/>
+        </w:sectPr>
+      </w:pPr>
+      <w:r>
+        <w:rPr>
+          <w:rFonts w:ascii="Arial" w:hAnsi="Arial" w:cs="Arial"/>
+        </w:rPr>
+        <w:t xml:space="preserve">Source: </w:t>
+      </w:r>
+      <w:r>
+        <w:rPr>
+          <w:rFonts w:ascii="Arial" w:hAnsi="Arial" w:cs="Arial"/>
+        </w:rPr>
+        <w:t>https://www.drainageconsultantsltd.co.uk/services/drainage-gradients-falls/</w:t>
+      </w:r>
+    </w:p>
+    <w:p>
+      <w:pPr>
+        <w:rPr>
+          <w:rFonts w:ascii="Arial" w:hAnsi="Arial" w:cs="Arial"/>
+        </w:rPr>
+        <w:sectPr>
+          <w:type w:val="continuous"/>
+          <w:pgSz w:w="11906" w:h="16838"/>
+          <w:pgMar w:top="1440" w:right="1440" w:bottom="1440" w:left="1440" w:header="708" w:footer="708" w:gutter="0"/>
+          <w:cols w:space="708"/>
+          <w:docGrid w:linePitch="360"/>
+        </w:sectPr>
+      </w:pPr>
+    </w:p>
+    <w:p>
+      <w:pPr>
+        <w:rPr>
+          <w:rFonts w:ascii="Arial" w:hAnsi="Arial" w:cs="Arial"/>
+        </w:rPr>
+      </w:pPr>
+    </w:p>
+    <w:p>
+      <w:pPr>
+        <w:rPr>
+          <w:rFonts w:ascii="Arial" w:hAnsi="Arial" w:cs="Arial"/>
+        </w:rPr>
+      </w:pPr>
+    </w:p>
+    <w:p>
+      <w:pPr>
+        <w:rPr>
+          <w:rFonts w:ascii="Arial" w:hAnsi="Arial" w:cs="Arial"/>
+        </w:rPr>
+      </w:pPr>
+    </w:p>
+    <w:p>
+      <w:pPr>
+        <w:rPr>
+          <w:rFonts w:ascii="Arial" w:hAnsi="Arial" w:cs="Arial"/>
+          <w:b/>
+          <w:bCs/>
+        </w:rPr>
+      </w:pPr>
+      <w:r>
+        <w:rPr>
+          <w:rFonts w:ascii="Arial" w:hAnsi="Arial" w:cs="Arial"/>
+          <w:b/>
+          <w:bCs/>
+        </w:rPr>
+        <w:t xml:space="preserve">Counterfactuals </w:t>
+      </w:r>
+    </w:p>
+    <w:p>
+      <w:pPr>
+        <w:rPr>
+          <w:rFonts w:ascii="Arial" w:hAnsi="Arial" w:cs="Arial"/>
+        </w:rPr>
+      </w:pPr>
+    </w:p>
+    <w:p>
+      <w:pPr>
+        <w:rPr>
+          <w:rFonts w:ascii="Arial" w:hAnsi="Arial" w:cs="Arial"/>
+        </w:rPr>
+      </w:pPr>
+      <w:r>
+        <w:rPr>
+          <w:rFonts w:ascii="Arial" w:hAnsi="Arial" w:cs="Arial"/>
+        </w:rPr>
+        <w:t>More storage tanks</w:t>
+      </w:r>
+    </w:p>
+    <w:p>
+      <w:pPr>
+        <w:rPr>
+          <w:rFonts w:ascii="Arial" w:hAnsi="Arial" w:cs="Arial"/>
+        </w:rPr>
+      </w:pPr>
+    </w:p>
+    <w:p>
+      <w:pPr>
+        <w:rPr>
+          <w:rFonts w:ascii="Arial" w:hAnsi="Arial" w:cs="Arial"/>
+        </w:rPr>
+      </w:pPr>
+      <w:r>
+        <w:rPr>
+          <w:rFonts w:ascii="Arial" w:hAnsi="Arial" w:cs="Arial"/>
+        </w:rPr>
+        <w:t xml:space="preserve">Thames Tideway Tunnel </w:t>
+      </w:r>
+    </w:p>
+    <w:p>
+      <w:pPr>
+        <w:rPr>
+          <w:rFonts w:ascii="Arial" w:hAnsi="Arial" w:cs="Arial"/>
+        </w:rPr>
+      </w:pPr>
+    </w:p>
+    <w:p>
+      <w:pPr>
+        <w:rPr>
+          <w:rFonts w:ascii="Arial" w:hAnsi="Arial" w:cs="Arial"/>
+        </w:rPr>
+      </w:pPr>
+      <w:r>
+        <w:rPr>
+          <w:rFonts w:ascii="Arial" w:hAnsi="Arial" w:cs="Arial"/>
+        </w:rPr>
+        <w:t>DWMP</w:t>
+      </w:r>
+    </w:p>
+    <w:p>
+      <w:pPr>
+        <w:rPr>
+          <w:rFonts w:ascii="Arial" w:hAnsi="Arial" w:cs="Arial"/>
+        </w:rPr>
+      </w:pPr>
+    </w:p>
+    <w:p>
+      <w:pPr>
+        <w:rPr>
+          <w:rFonts w:ascii="Arial" w:hAnsi="Arial" w:cs="Arial"/>
+        </w:rPr>
+      </w:pPr>
+    </w:p>
+    <w:p/>
+    <w:p>
+      <w:pPr>
+        <w:rPr>
+          <w:rFonts w:ascii="Arial" w:hAnsi="Arial" w:cs="Arial"/>
+          <w:b/>
+          <w:bCs/>
+        </w:rPr>
+      </w:pPr>
+    </w:p>
+    <w:p>
+      <w:pPr>
+        <w:rPr>
+          <w:rFonts w:ascii="Arial" w:hAnsi="Arial" w:cs="Arial"/>
+        </w:rPr>
+      </w:pPr>
+    </w:p>
+    <w:p>
+      <w:pPr>
+        <w:rPr>
+          <w:rFonts w:ascii="Arial" w:hAnsi="Arial" w:cs="Arial"/>
+        </w:rPr>
+      </w:pPr>
+    </w:p>
+    <w:p>
+      <w:pPr>
+        <w:rPr>
+          <w:rFonts w:ascii="Arial" w:hAnsi="Arial" w:cs="Arial"/>
+          <w:b/>
+          <w:bCs/>
+        </w:rPr>
+      </w:pPr>
+      <w:r>
+        <w:rPr>
+          <w:rFonts w:ascii="Arial" w:hAnsi="Arial" w:cs="Arial"/>
+          <w:b/>
+          <w:bCs/>
+        </w:rPr>
+        <w:br w:type="page"/>
+      </w:r>
+    </w:p>
+    <w:p>
+      <w:pPr>
+        <w:rPr>
+          <w:rFonts w:ascii="Arial" w:hAnsi="Arial" w:cs="Arial"/>
+          <w:b/>
+          <w:bCs/>
+        </w:rPr>
+      </w:pPr>
+      <w:r>
+        <w:rPr>
+          <w:rFonts w:ascii="Arial" w:hAnsi="Arial" w:cs="Arial"/>
+          <w:b/>
+          <w:bCs/>
+        </w:rPr>
+        <w:lastRenderedPageBreak/>
         <w:t>Context</w:t>
       </w:r>
     </w:p>
@@ -122,7 +2839,7 @@
                     <pic:cNvPicPr/>
                   </pic:nvPicPr>
                   <pic:blipFill>
-                    <a:blip r:embed="rId5"/>
+                    <a:blip r:embed="rId6"/>
                     <a:stretch>
                       <a:fillRect/>
                     </a:stretch>
@@ -399,6 +3116,8 @@
       <w:pPr>
         <w:rPr>
           <w:rFonts w:ascii="Arial" w:hAnsi="Arial" w:cs="Arial"/>
+          <w:b/>
+          <w:bCs/>
         </w:rPr>
       </w:pPr>
       <w:r>
@@ -413,25 +3132,73 @@
         </w:rPr>
         <w:t xml:space="preserve"> or Major spill events </w:t>
       </w:r>
-    </w:p>
-    <w:p>
-      <w:pPr>
-        <w:rPr>
-          <w:rFonts w:ascii="Arial" w:hAnsi="Arial" w:cs="Arial"/>
-        </w:rPr>
-      </w:pPr>
-    </w:p>
-    <w:p>
-      <w:pPr>
-        <w:rPr>
-          <w:rFonts w:ascii="Arial" w:hAnsi="Arial" w:cs="Arial"/>
-        </w:rPr>
-      </w:pPr>
-      <w:r>
-        <w:rPr>
-          <w:rFonts w:ascii="Arial" w:hAnsi="Arial" w:cs="Arial"/>
+      <w:r>
+        <w:rPr>
+          <w:rFonts w:ascii="Arial" w:hAnsi="Arial" w:cs="Arial"/>
+        </w:rPr>
+        <w:sym w:font="Wingdings" w:char="F0DF"/>
+      </w:r>
+      <w:r>
+        <w:rPr>
+          <w:rFonts w:ascii="Arial" w:hAnsi="Arial" w:cs="Arial"/>
+        </w:rPr>
+        <w:t xml:space="preserve"> </w:t>
+      </w:r>
+      <w:r>
+        <w:rPr>
+          <w:rFonts w:ascii="Segoe UI" w:hAnsi="Segoe UI" w:cs="Segoe UI"/>
+          <w:color w:val="0F1115"/>
+          <w:shd w:val="clear" w:color="auto" w:fill="FFFFFF"/>
+        </w:rPr>
+        <w:t> </w:t>
+      </w:r>
+      <w:r>
+        <w:rPr>
+          <w:rStyle w:val="Strong"/>
+          <w:rFonts w:ascii="Segoe UI" w:hAnsi="Segoe UI" w:cs="Segoe UI"/>
+          <w:color w:val="0F1115"/>
+          <w:shd w:val="clear" w:color="auto" w:fill="FFFFFF"/>
+        </w:rPr>
+        <w:t xml:space="preserve">public, quantifiable, location-specific spill data that represents a large, asymmetric information </w:t>
+      </w:r>
+      <w:r>
+        <w:rPr>
+          <w:rStyle w:val="Strong"/>
+          <w:rFonts w:ascii="Segoe UI" w:hAnsi="Segoe UI" w:cs="Segoe UI"/>
+          <w:color w:val="0F1115"/>
+          <w:shd w:val="clear" w:color="auto" w:fill="FFFFFF"/>
         </w:rPr>
         <w:lastRenderedPageBreak/>
+        <w:t xml:space="preserve">shock. Sequenced by econological priority so condition on desirability of neighbourhood (or bathing waters, SSSIs), predict spill counts for all periods (pre- and post-EDM), </w:t>
+      </w:r>
+      <w:r>
+        <w:rPr>
+          <w:rFonts w:ascii="Segoe UI" w:hAnsi="Segoe UI" w:cs="Segoe UI"/>
+          <w:b/>
+          <w:bCs/>
+          <w:color w:val="0F1115"/>
+          <w:shd w:val="clear" w:color="auto" w:fill="FFFFFF"/>
+        </w:rPr>
+        <w:t>price trends for early-monitored and late-monitored CSOs should be similar</w:t>
+      </w:r>
+    </w:p>
+    <w:p>
+      <w:pPr>
+        <w:rPr>
+          <w:rFonts w:ascii="Arial" w:hAnsi="Arial" w:cs="Arial"/>
+        </w:rPr>
+      </w:pPr>
+    </w:p>
+    <w:p>
+      <w:pPr>
+        <w:rPr>
+          <w:rFonts w:ascii="Arial" w:hAnsi="Arial" w:cs="Arial"/>
+        </w:rPr>
+      </w:pPr>
+      <w:r>
+        <w:rPr>
+          <w:rFonts w:ascii="Arial" w:hAnsi="Arial" w:cs="Arial"/>
+        </w:rPr>
         <w:t>Rainfall as instrument for Spills, if not also correlated with flooding events</w:t>
       </w:r>
       <w:r>
@@ -751,7 +3518,7 @@
       <w:r>
         <w:t xml:space="preserve">Can get catchment maps from Stream Portal such as </w:t>
       </w:r>
-      <w:hyperlink r:id="rId6" w:history="1">
+      <w:hyperlink r:id="rId7" w:history="1">
         <w:r>
           <w:rPr>
             <w:rStyle w:val="Hyperlink"/>
@@ -832,6 +3599,7 @@
         <w:rPr>
           <w:rFonts w:hAnsi="Symbol"/>
         </w:rPr>
+        <w:lastRenderedPageBreak/>
         <w:t></w:t>
       </w:r>
       <w:r>
@@ -860,7 +3628,6 @@
         <w:rPr>
           <w:rFonts w:hAnsi="Symbol"/>
         </w:rPr>
-        <w:lastRenderedPageBreak/>
         <w:t></w:t>
       </w:r>
       <w:r>
@@ -1540,6 +4307,7 @@
           <w:lang w:eastAsia="en-GB"/>
           <w14:ligatures w14:val="none"/>
         </w:rPr>
+        <w:lastRenderedPageBreak/>
         <w:t>many gradients</w:t>
       </w:r>
     </w:p>
@@ -1612,7 +4380,6 @@
           <w:lang w:eastAsia="en-GB"/>
           <w14:ligatures w14:val="none"/>
         </w:rPr>
-        <w:lastRenderedPageBreak/>
         <w:t>Drainage applications: lay drains to main sewers</w:t>
       </w:r>
     </w:p>
@@ -2899,28 +5666,7 @@
         <w:pStyle w:val="NormalWeb"/>
       </w:pPr>
       <w:r>
-        <w:t>W</w:t>
-      </w:r>
-      <w:r>
-        <w:t>hile neighbourhoods could respond to:</w:t>
-      </w:r>
-      <w:r>
-        <w:t xml:space="preserve"> </w:t>
-      </w:r>
-      <w:r>
-        <w:t>proximity to a sewer,</w:t>
-      </w:r>
-      <w:r>
-        <w:t xml:space="preserve"> </w:t>
-      </w:r>
-      <w:r>
-        <w:t>surface sanitation improvements,</w:t>
-      </w:r>
-      <w:r>
-        <w:t xml:space="preserve"> </w:t>
-      </w:r>
-      <w:r>
-        <w:t xml:space="preserve">they </w:t>
+        <w:t xml:space="preserve">While neighbourhoods could respond to: proximity to a sewer, surface sanitation improvements, they </w:t>
       </w:r>
       <w:r>
         <w:rPr>
@@ -2932,25 +5678,7 @@
         <w:t>could not respond to</w:t>
       </w:r>
       <w:r>
-        <w:t>:</w:t>
-      </w:r>
-      <w:r>
-        <w:t xml:space="preserve"> </w:t>
-      </w:r>
-      <w:r>
-        <w:t>“This location will be 40 cm closer to hydraulic head limits under a 1-in-5-year storm.”</w:t>
-      </w:r>
-      <w:r>
-        <w:t xml:space="preserve"> </w:t>
-      </w:r>
-      <w:r>
-        <w:t>That information simply wasn’t available or salient.</w:t>
-      </w:r>
-      <w:r>
-        <w:t xml:space="preserve"> </w:t>
-      </w:r>
-      <w:r>
-        <w:t xml:space="preserve">Pinch points are </w:t>
+        <w:t xml:space="preserve">: “This location will be 40 cm closer to hydraulic head limits under a 1-in-5-year storm.” That information simply wasn’t available or salient. Pinch points are </w:t>
       </w:r>
       <w:r>
         <w:rPr>
@@ -2960,10 +5688,7 @@
         <w:t>second-order features</w:t>
       </w:r>
       <w:r>
-        <w:t xml:space="preserve"> neighbourhoods could not observe</w:t>
-      </w:r>
-      <w:r>
-        <w:t xml:space="preserve">. </w:t>
+        <w:t xml:space="preserve"> neighbourhoods could not observe. </w:t>
       </w:r>
     </w:p>
     <w:p>
@@ -3284,7 +6009,7 @@
               </w:rPr>
               <w:t xml:space="preserve"> over 25 years </w:t>
             </w:r>
-            <w:hyperlink r:id="rId7" w:tgtFrame="_blank" w:history="1">
+            <w:hyperlink r:id="rId8" w:tgtFrame="_blank" w:history="1">
               <w:r>
                 <w:rPr>
                   <w:rFonts w:ascii="Arial" w:eastAsia="Times New Roman" w:hAnsi="Arial" w:cs="Arial"/>
@@ -3323,7 +6048,7 @@
               </w:rPr>
               <w:t xml:space="preserve">Large environmental / public health benefit, but very high cost; extremely disruptive. </w:t>
             </w:r>
-            <w:hyperlink r:id="rId8" w:tgtFrame="_blank" w:history="1">
+            <w:hyperlink r:id="rId9" w:tgtFrame="_blank" w:history="1">
               <w:r>
                 <w:rPr>
                   <w:rFonts w:ascii="Arial" w:eastAsia="Times New Roman" w:hAnsi="Arial" w:cs="Arial"/>
@@ -3382,7 +6107,7 @@
               </w:rPr>
               <w:t xml:space="preserve"> per household </w:t>
             </w:r>
-            <w:hyperlink r:id="rId9" w:tgtFrame="_blank" w:history="1">
+            <w:hyperlink r:id="rId10" w:tgtFrame="_blank" w:history="1">
               <w:r>
                 <w:rPr>
                   <w:rFonts w:ascii="Arial" w:eastAsia="Times New Roman" w:hAnsi="Arial" w:cs="Arial"/>
@@ -3474,65 +6199,6 @@
               </w:rPr>
               <w:t xml:space="preserve"> depending on how strict (and delivery scenario) </w:t>
             </w:r>
-            <w:hyperlink r:id="rId10" w:tgtFrame="_blank" w:history="1">
-              <w:r>
-                <w:rPr>
-                  <w:rFonts w:ascii="Arial" w:eastAsia="Times New Roman" w:hAnsi="Arial" w:cs="Arial"/>
-                  <w:color w:val="0000FF"/>
-                  <w:kern w:val="0"/>
-                  <w:u w:val="single"/>
-                  <w:lang w:eastAsia="en-GB"/>
-                  <w14:ligatures w14:val="none"/>
-                </w:rPr>
-                <w:t>GOV.UK+1</w:t>
-              </w:r>
-            </w:hyperlink>
-          </w:p>
-        </w:tc>
-        <w:tc>
-          <w:tcPr>
-            <w:tcW w:w="0" w:type="auto"/>
-            <w:vAlign w:val="center"/>
-            <w:hideMark/>
-          </w:tcPr>
-          <w:p>
-            <w:pPr>
-              <w:rPr>
-                <w:rFonts w:ascii="Arial" w:eastAsia="Times New Roman" w:hAnsi="Arial" w:cs="Arial"/>
-                <w:kern w:val="0"/>
-                <w:lang w:eastAsia="en-GB"/>
-                <w14:ligatures w14:val="none"/>
-              </w:rPr>
-            </w:pPr>
-            <w:r>
-              <w:rPr>
-                <w:rFonts w:ascii="Arial" w:eastAsia="Times New Roman" w:hAnsi="Arial" w:cs="Arial"/>
-                <w:kern w:val="0"/>
-                <w:lang w:eastAsia="en-GB"/>
-                <w14:ligatures w14:val="none"/>
-              </w:rPr>
-              <w:t xml:space="preserve">Benefits range </w:t>
-            </w:r>
-            <w:r>
-              <w:rPr>
-                <w:rFonts w:ascii="Arial" w:eastAsia="Times New Roman" w:hAnsi="Arial" w:cs="Arial"/>
-                <w:b/>
-                <w:bCs/>
-                <w:kern w:val="0"/>
-                <w:lang w:eastAsia="en-GB"/>
-                <w14:ligatures w14:val="none"/>
-              </w:rPr>
-              <w:t>£2-£39 billion</w:t>
-            </w:r>
-            <w:r>
-              <w:rPr>
-                <w:rFonts w:ascii="Arial" w:eastAsia="Times New Roman" w:hAnsi="Arial" w:cs="Arial"/>
-                <w:kern w:val="0"/>
-                <w:lang w:eastAsia="en-GB"/>
-                <w14:ligatures w14:val="none"/>
-              </w:rPr>
-              <w:t xml:space="preserve"> depending on policy &amp; scenario </w:t>
-            </w:r>
             <w:hyperlink r:id="rId11" w:tgtFrame="_blank" w:history="1">
               <w:r>
                 <w:rPr>
@@ -3570,6 +6236,65 @@
                 <w:lang w:eastAsia="en-GB"/>
                 <w14:ligatures w14:val="none"/>
               </w:rPr>
+              <w:t xml:space="preserve">Benefits range </w:t>
+            </w:r>
+            <w:r>
+              <w:rPr>
+                <w:rFonts w:ascii="Arial" w:eastAsia="Times New Roman" w:hAnsi="Arial" w:cs="Arial"/>
+                <w:b/>
+                <w:bCs/>
+                <w:kern w:val="0"/>
+                <w:lang w:eastAsia="en-GB"/>
+                <w14:ligatures w14:val="none"/>
+              </w:rPr>
+              <w:t>£2-£39 billion</w:t>
+            </w:r>
+            <w:r>
+              <w:rPr>
+                <w:rFonts w:ascii="Arial" w:eastAsia="Times New Roman" w:hAnsi="Arial" w:cs="Arial"/>
+                <w:kern w:val="0"/>
+                <w:lang w:eastAsia="en-GB"/>
+                <w14:ligatures w14:val="none"/>
+              </w:rPr>
+              <w:t xml:space="preserve"> depending on policy &amp; scenario </w:t>
+            </w:r>
+            <w:hyperlink r:id="rId12" w:tgtFrame="_blank" w:history="1">
+              <w:r>
+                <w:rPr>
+                  <w:rFonts w:ascii="Arial" w:eastAsia="Times New Roman" w:hAnsi="Arial" w:cs="Arial"/>
+                  <w:color w:val="0000FF"/>
+                  <w:kern w:val="0"/>
+                  <w:u w:val="single"/>
+                  <w:lang w:eastAsia="en-GB"/>
+                  <w14:ligatures w14:val="none"/>
+                </w:rPr>
+                <w:t>GOV.UK+1</w:t>
+              </w:r>
+            </w:hyperlink>
+          </w:p>
+        </w:tc>
+        <w:tc>
+          <w:tcPr>
+            <w:tcW w:w="0" w:type="auto"/>
+            <w:vAlign w:val="center"/>
+            <w:hideMark/>
+          </w:tcPr>
+          <w:p>
+            <w:pPr>
+              <w:rPr>
+                <w:rFonts w:ascii="Arial" w:eastAsia="Times New Roman" w:hAnsi="Arial" w:cs="Arial"/>
+                <w:kern w:val="0"/>
+                <w:lang w:eastAsia="en-GB"/>
+                <w14:ligatures w14:val="none"/>
+              </w:rPr>
+            </w:pPr>
+            <w:r>
+              <w:rPr>
+                <w:rFonts w:ascii="Arial" w:eastAsia="Times New Roman" w:hAnsi="Arial" w:cs="Arial"/>
+                <w:kern w:val="0"/>
+                <w:lang w:eastAsia="en-GB"/>
+                <w14:ligatures w14:val="none"/>
+              </w:rPr>
               <w:t xml:space="preserve">Bill impacts between </w:t>
             </w:r>
             <w:r>
@@ -3592,7 +6317,7 @@
               </w:rPr>
               <w:t xml:space="preserve"> per household </w:t>
             </w:r>
-            <w:hyperlink r:id="rId12" w:tgtFrame="_blank" w:history="1">
+            <w:hyperlink r:id="rId13" w:tgtFrame="_blank" w:history="1">
               <w:r>
                 <w:rPr>
                   <w:rFonts w:ascii="Arial" w:eastAsia="Times New Roman" w:hAnsi="Arial" w:cs="Arial"/>
@@ -3684,45 +6409,6 @@
               </w:rPr>
               <w:t xml:space="preserve"> </w:t>
             </w:r>
-            <w:hyperlink r:id="rId13" w:tgtFrame="_blank" w:history="1">
-              <w:r>
-                <w:rPr>
-                  <w:rFonts w:ascii="Arial" w:eastAsia="Times New Roman" w:hAnsi="Arial" w:cs="Arial"/>
-                  <w:color w:val="0000FF"/>
-                  <w:kern w:val="0"/>
-                  <w:u w:val="single"/>
-                  <w:lang w:eastAsia="en-GB"/>
-                  <w14:ligatures w14:val="none"/>
-                </w:rPr>
-                <w:t>GOV.UK</w:t>
-              </w:r>
-            </w:hyperlink>
-          </w:p>
-        </w:tc>
-        <w:tc>
-          <w:tcPr>
-            <w:tcW w:w="0" w:type="auto"/>
-            <w:vAlign w:val="center"/>
-            <w:hideMark/>
-          </w:tcPr>
-          <w:p>
-            <w:pPr>
-              <w:rPr>
-                <w:rFonts w:ascii="Arial" w:eastAsia="Times New Roman" w:hAnsi="Arial" w:cs="Arial"/>
-                <w:kern w:val="0"/>
-                <w:lang w:eastAsia="en-GB"/>
-                <w14:ligatures w14:val="none"/>
-              </w:rPr>
-            </w:pPr>
-            <w:r>
-              <w:rPr>
-                <w:rFonts w:ascii="Arial" w:eastAsia="Times New Roman" w:hAnsi="Arial" w:cs="Arial"/>
-                <w:kern w:val="0"/>
-                <w:lang w:eastAsia="en-GB"/>
-                <w14:ligatures w14:val="none"/>
-              </w:rPr>
-              <w:t xml:space="preserve">Benefits not always enough to cover full cost at national level; local benefits can be more favourable. </w:t>
-            </w:r>
             <w:hyperlink r:id="rId14" w:tgtFrame="_blank" w:history="1">
               <w:r>
                 <w:rPr>
@@ -3756,6 +6442,45 @@
             <w:r>
               <w:rPr>
                 <w:rFonts w:ascii="Arial" w:eastAsia="Times New Roman" w:hAnsi="Arial" w:cs="Arial"/>
+                <w:kern w:val="0"/>
+                <w:lang w:eastAsia="en-GB"/>
+                <w14:ligatures w14:val="none"/>
+              </w:rPr>
+              <w:t xml:space="preserve">Benefits not always enough to cover full cost at national level; local benefits can be more favourable. </w:t>
+            </w:r>
+            <w:hyperlink r:id="rId15" w:tgtFrame="_blank" w:history="1">
+              <w:r>
+                <w:rPr>
+                  <w:rFonts w:ascii="Arial" w:eastAsia="Times New Roman" w:hAnsi="Arial" w:cs="Arial"/>
+                  <w:color w:val="0000FF"/>
+                  <w:kern w:val="0"/>
+                  <w:u w:val="single"/>
+                  <w:lang w:eastAsia="en-GB"/>
+                  <w14:ligatures w14:val="none"/>
+                </w:rPr>
+                <w:t>GOV.UK</w:t>
+              </w:r>
+            </w:hyperlink>
+          </w:p>
+        </w:tc>
+        <w:tc>
+          <w:tcPr>
+            <w:tcW w:w="0" w:type="auto"/>
+            <w:vAlign w:val="center"/>
+            <w:hideMark/>
+          </w:tcPr>
+          <w:p>
+            <w:pPr>
+              <w:rPr>
+                <w:rFonts w:ascii="Arial" w:eastAsia="Times New Roman" w:hAnsi="Arial" w:cs="Arial"/>
+                <w:kern w:val="0"/>
+                <w:lang w:eastAsia="en-GB"/>
+                <w14:ligatures w14:val="none"/>
+              </w:rPr>
+            </w:pPr>
+            <w:r>
+              <w:rPr>
+                <w:rFonts w:ascii="Arial" w:eastAsia="Times New Roman" w:hAnsi="Arial" w:cs="Arial"/>
                 <w:b/>
                 <w:bCs/>
                 <w:kern w:val="0"/>
@@ -3773,7 +6498,7 @@
               </w:rPr>
               <w:t xml:space="preserve"> impact on household bill </w:t>
             </w:r>
-            <w:hyperlink r:id="rId15" w:tgtFrame="_blank" w:history="1">
+            <w:hyperlink r:id="rId16" w:tgtFrame="_blank" w:history="1">
               <w:r>
                 <w:rPr>
                   <w:rFonts w:ascii="Arial" w:eastAsia="Times New Roman" w:hAnsi="Arial" w:cs="Arial"/>
@@ -3865,45 +6590,6 @@
               </w:rPr>
               <w:t xml:space="preserve"> </w:t>
             </w:r>
-            <w:hyperlink r:id="rId16" w:tgtFrame="_blank" w:history="1">
-              <w:r>
-                <w:rPr>
-                  <w:rFonts w:ascii="Arial" w:eastAsia="Times New Roman" w:hAnsi="Arial" w:cs="Arial"/>
-                  <w:color w:val="0000FF"/>
-                  <w:kern w:val="0"/>
-                  <w:u w:val="single"/>
-                  <w:lang w:eastAsia="en-GB"/>
-                  <w14:ligatures w14:val="none"/>
-                </w:rPr>
-                <w:t>GOV.UK</w:t>
-              </w:r>
-            </w:hyperlink>
-          </w:p>
-        </w:tc>
-        <w:tc>
-          <w:tcPr>
-            <w:tcW w:w="0" w:type="auto"/>
-            <w:vAlign w:val="center"/>
-            <w:hideMark/>
-          </w:tcPr>
-          <w:p>
-            <w:pPr>
-              <w:rPr>
-                <w:rFonts w:ascii="Arial" w:eastAsia="Times New Roman" w:hAnsi="Arial" w:cs="Arial"/>
-                <w:kern w:val="0"/>
-                <w:lang w:eastAsia="en-GB"/>
-                <w14:ligatures w14:val="none"/>
-              </w:rPr>
-            </w:pPr>
-            <w:r>
-              <w:rPr>
-                <w:rFonts w:ascii="Arial" w:eastAsia="Times New Roman" w:hAnsi="Arial" w:cs="Arial"/>
-                <w:kern w:val="0"/>
-                <w:lang w:eastAsia="en-GB"/>
-                <w14:ligatures w14:val="none"/>
-              </w:rPr>
-              <w:t xml:space="preserve">Benefits here stronger relative to cost because the environmental impact is higher, but still large investment. </w:t>
-            </w:r>
             <w:hyperlink r:id="rId17" w:tgtFrame="_blank" w:history="1">
               <w:r>
                 <w:rPr>
@@ -3937,6 +6623,45 @@
             <w:r>
               <w:rPr>
                 <w:rFonts w:ascii="Arial" w:eastAsia="Times New Roman" w:hAnsi="Arial" w:cs="Arial"/>
+                <w:kern w:val="0"/>
+                <w:lang w:eastAsia="en-GB"/>
+                <w14:ligatures w14:val="none"/>
+              </w:rPr>
+              <w:t xml:space="preserve">Benefits here stronger relative to cost because the environmental impact is higher, but still large investment. </w:t>
+            </w:r>
+            <w:hyperlink r:id="rId18" w:tgtFrame="_blank" w:history="1">
+              <w:r>
+                <w:rPr>
+                  <w:rFonts w:ascii="Arial" w:eastAsia="Times New Roman" w:hAnsi="Arial" w:cs="Arial"/>
+                  <w:color w:val="0000FF"/>
+                  <w:kern w:val="0"/>
+                  <w:u w:val="single"/>
+                  <w:lang w:eastAsia="en-GB"/>
+                  <w14:ligatures w14:val="none"/>
+                </w:rPr>
+                <w:t>GOV.UK</w:t>
+              </w:r>
+            </w:hyperlink>
+          </w:p>
+        </w:tc>
+        <w:tc>
+          <w:tcPr>
+            <w:tcW w:w="0" w:type="auto"/>
+            <w:vAlign w:val="center"/>
+            <w:hideMark/>
+          </w:tcPr>
+          <w:p>
+            <w:pPr>
+              <w:rPr>
+                <w:rFonts w:ascii="Arial" w:eastAsia="Times New Roman" w:hAnsi="Arial" w:cs="Arial"/>
+                <w:kern w:val="0"/>
+                <w:lang w:eastAsia="en-GB"/>
+                <w14:ligatures w14:val="none"/>
+              </w:rPr>
+            </w:pPr>
+            <w:r>
+              <w:rPr>
+                <w:rFonts w:ascii="Arial" w:eastAsia="Times New Roman" w:hAnsi="Arial" w:cs="Arial"/>
                 <w:b/>
                 <w:bCs/>
                 <w:kern w:val="0"/>
@@ -3954,7 +6679,7 @@
               </w:rPr>
               <w:t xml:space="preserve"> per household </w:t>
             </w:r>
-            <w:hyperlink r:id="rId18" w:tgtFrame="_blank" w:history="1">
+            <w:hyperlink r:id="rId19" w:tgtFrame="_blank" w:history="1">
               <w:r>
                 <w:rPr>
                   <w:rFonts w:ascii="Arial" w:eastAsia="Times New Roman" w:hAnsi="Arial" w:cs="Arial"/>
@@ -4046,45 +6771,6 @@
               </w:rPr>
               <w:t xml:space="preserve"> for those specific improvements </w:t>
             </w:r>
-            <w:hyperlink r:id="rId19" w:tgtFrame="_blank" w:history="1">
-              <w:r>
-                <w:rPr>
-                  <w:rFonts w:ascii="Arial" w:eastAsia="Times New Roman" w:hAnsi="Arial" w:cs="Arial"/>
-                  <w:color w:val="0000FF"/>
-                  <w:kern w:val="0"/>
-                  <w:u w:val="single"/>
-                  <w:lang w:eastAsia="en-GB"/>
-                  <w14:ligatures w14:val="none"/>
-                </w:rPr>
-                <w:t>GOV.UK</w:t>
-              </w:r>
-            </w:hyperlink>
-          </w:p>
-        </w:tc>
-        <w:tc>
-          <w:tcPr>
-            <w:tcW w:w="0" w:type="auto"/>
-            <w:vAlign w:val="center"/>
-            <w:hideMark/>
-          </w:tcPr>
-          <w:p>
-            <w:pPr>
-              <w:rPr>
-                <w:rFonts w:ascii="Arial" w:eastAsia="Times New Roman" w:hAnsi="Arial" w:cs="Arial"/>
-                <w:kern w:val="0"/>
-                <w:lang w:eastAsia="en-GB"/>
-                <w14:ligatures w14:val="none"/>
-              </w:rPr>
-            </w:pPr>
-            <w:r>
-              <w:rPr>
-                <w:rFonts w:ascii="Arial" w:eastAsia="Times New Roman" w:hAnsi="Arial" w:cs="Arial"/>
-                <w:kern w:val="0"/>
-                <w:lang w:eastAsia="en-GB"/>
-                <w14:ligatures w14:val="none"/>
-              </w:rPr>
-              <w:t xml:space="preserve">More modest benefits compared to the broader policies, but more likely to resonate with public (health / amenity) in affected areas. </w:t>
-            </w:r>
             <w:hyperlink r:id="rId20" w:tgtFrame="_blank" w:history="1">
               <w:r>
                 <w:rPr>
@@ -4118,22 +6804,11 @@
             <w:r>
               <w:rPr>
                 <w:rFonts w:ascii="Arial" w:eastAsia="Times New Roman" w:hAnsi="Arial" w:cs="Arial"/>
-                <w:b/>
-                <w:bCs/>
-                <w:kern w:val="0"/>
-                <w:lang w:eastAsia="en-GB"/>
-                <w14:ligatures w14:val="none"/>
-              </w:rPr>
-              <w:t>£13-£48/year</w:t>
-            </w:r>
-            <w:r>
-              <w:rPr>
-                <w:rFonts w:ascii="Arial" w:eastAsia="Times New Roman" w:hAnsi="Arial" w:cs="Arial"/>
-                <w:kern w:val="0"/>
-                <w:lang w:eastAsia="en-GB"/>
-                <w14:ligatures w14:val="none"/>
-              </w:rPr>
-              <w:t xml:space="preserve"> per household in affected areas </w:t>
+                <w:kern w:val="0"/>
+                <w:lang w:eastAsia="en-GB"/>
+                <w14:ligatures w14:val="none"/>
+              </w:rPr>
+              <w:t xml:space="preserve">More modest benefits compared to the broader policies, but more likely to resonate with public (health / amenity) in affected areas. </w:t>
             </w:r>
             <w:hyperlink r:id="rId21" w:tgtFrame="_blank" w:history="1">
               <w:r>
@@ -4150,6 +6825,56 @@
             </w:hyperlink>
           </w:p>
         </w:tc>
+        <w:tc>
+          <w:tcPr>
+            <w:tcW w:w="0" w:type="auto"/>
+            <w:vAlign w:val="center"/>
+            <w:hideMark/>
+          </w:tcPr>
+          <w:p>
+            <w:pPr>
+              <w:rPr>
+                <w:rFonts w:ascii="Arial" w:eastAsia="Times New Roman" w:hAnsi="Arial" w:cs="Arial"/>
+                <w:kern w:val="0"/>
+                <w:lang w:eastAsia="en-GB"/>
+                <w14:ligatures w14:val="none"/>
+              </w:rPr>
+            </w:pPr>
+            <w:r>
+              <w:rPr>
+                <w:rFonts w:ascii="Arial" w:eastAsia="Times New Roman" w:hAnsi="Arial" w:cs="Arial"/>
+                <w:b/>
+                <w:bCs/>
+                <w:kern w:val="0"/>
+                <w:lang w:eastAsia="en-GB"/>
+                <w14:ligatures w14:val="none"/>
+              </w:rPr>
+              <w:t>£13-£48/year</w:t>
+            </w:r>
+            <w:r>
+              <w:rPr>
+                <w:rFonts w:ascii="Arial" w:eastAsia="Times New Roman" w:hAnsi="Arial" w:cs="Arial"/>
+                <w:kern w:val="0"/>
+                <w:lang w:eastAsia="en-GB"/>
+                <w14:ligatures w14:val="none"/>
+              </w:rPr>
+              <w:t xml:space="preserve"> per household in affected areas </w:t>
+            </w:r>
+            <w:hyperlink r:id="rId22" w:tgtFrame="_blank" w:history="1">
+              <w:r>
+                <w:rPr>
+                  <w:rFonts w:ascii="Arial" w:eastAsia="Times New Roman" w:hAnsi="Arial" w:cs="Arial"/>
+                  <w:color w:val="0000FF"/>
+                  <w:kern w:val="0"/>
+                  <w:u w:val="single"/>
+                  <w:lang w:eastAsia="en-GB"/>
+                  <w14:ligatures w14:val="none"/>
+                </w:rPr>
+                <w:t>GOV.UK</w:t>
+              </w:r>
+            </w:hyperlink>
+          </w:p>
+        </w:tc>
       </w:tr>
     </w:tbl>
     <w:p>
@@ -4168,7 +6893,7 @@
           <w:kern w:val="0"/>
           <w:lang w:eastAsia="en-GB"/>
         </w:rPr>
-        <w:pict w14:anchorId="6C700FB3">
+        <w:pict w14:anchorId="421E9392">
           <v:rect id="_x0000_i1025" alt="" style="width:451.3pt;height:.05pt;mso-width-percent:0;mso-height-percent:0;mso-width-percent:0;mso-height-percent:0" o:hralign="center" o:hrstd="t" o:hr="t" fillcolor="#a0a0a0" stroked="f"/>
         </w:pict>
       </w:r>
@@ -7710,7 +10435,7 @@
         <w:br/>
         <w:t xml:space="preserve">Court found the UK in breach of the Urban Waste Water Treatment Directive (91/271/EEC) over, inter alia, combined sewer overflows (notably London &amp; Whitburn). This raised the stakes on demonstrating control/monitoring. </w:t>
       </w:r>
-      <w:hyperlink r:id="rId22" w:tgtFrame="_blank" w:history="1">
+      <w:hyperlink r:id="rId23" w:tgtFrame="_blank" w:history="1">
         <w:r>
           <w:rPr>
             <w:rFonts w:ascii="Arial" w:eastAsia="Times New Roman" w:hAnsi="Arial" w:cs="Arial"/>
@@ -7821,7 +10546,7 @@
         </w:rPr>
         <w:t xml:space="preserve">.” (case summary). </w:t>
       </w:r>
-      <w:hyperlink r:id="rId23" w:tgtFrame="_blank" w:history="1">
+      <w:hyperlink r:id="rId24" w:tgtFrame="_blank" w:history="1">
         <w:r>
           <w:rPr>
             <w:rStyle w:val="max-w-15ch"/>
@@ -7890,7 +10615,7 @@
         </w:rPr>
         <w:t xml:space="preserve"> in a number of locations…” (context for later 2012 ruling). </w:t>
       </w:r>
-      <w:hyperlink r:id="rId24" w:tgtFrame="_blank" w:history="1">
+      <w:hyperlink r:id="rId25" w:tgtFrame="_blank" w:history="1">
         <w:r>
           <w:rPr>
             <w:rStyle w:val="max-w-15ch"/>
@@ -7912,7 +10637,7 @@
         <w:br/>
         <w:t xml:space="preserve">Full judgment confirms long-running infringement steps (letters of formal notice, reasoned opinions) leading to court. </w:t>
       </w:r>
-      <w:hyperlink r:id="rId25" w:tgtFrame="_blank" w:history="1">
+      <w:hyperlink r:id="rId26" w:tgtFrame="_blank" w:history="1">
         <w:r>
           <w:rPr>
             <w:rStyle w:val="max-w-15ch"/>
@@ -7974,7 +10699,7 @@
         <w:br/>
         <w:t xml:space="preserve">Sets the background of EU enforcement on UK wastewater/overflows. </w:t>
       </w:r>
-      <w:hyperlink r:id="rId26" w:tgtFrame="_blank" w:history="1">
+      <w:hyperlink r:id="rId27" w:tgtFrame="_blank" w:history="1">
         <w:r>
           <w:rPr>
             <w:rFonts w:ascii="Arial" w:eastAsia="Times New Roman" w:hAnsi="Arial" w:cs="Arial"/>
@@ -8021,7 +10746,7 @@
         <w:br/>
         <w:t xml:space="preserve">Summarises the Commission’s interpretation: CSO spills should be exceptional; frequency/volume matter—helpful context for why monitoring was pushed. </w:t>
       </w:r>
-      <w:hyperlink r:id="rId27" w:tgtFrame="_blank" w:history="1">
+      <w:hyperlink r:id="rId28" w:tgtFrame="_blank" w:history="1">
         <w:r>
           <w:rPr>
             <w:rFonts w:ascii="Arial" w:eastAsia="Times New Roman" w:hAnsi="Arial" w:cs="Arial"/>
@@ -8094,7 +10819,7 @@
         <w:br/>
         <w:t xml:space="preserve">Widely cited example of public concern and media scrutiny over sewage-related beach impacts. </w:t>
       </w:r>
-      <w:hyperlink r:id="rId28" w:tgtFrame="_blank" w:history="1">
+      <w:hyperlink r:id="rId29" w:tgtFrame="_blank" w:history="1">
         <w:r>
           <w:rPr>
             <w:rFonts w:ascii="Arial" w:eastAsia="Times New Roman" w:hAnsi="Arial" w:cs="Arial"/>
@@ -8141,7 +10866,7 @@
         <w:br/>
         <w:t xml:space="preserve">Campaigners’ data that kept the issue in headlines. </w:t>
       </w:r>
-      <w:hyperlink r:id="rId29" w:tgtFrame="_blank" w:history="1">
+      <w:hyperlink r:id="rId30" w:tgtFrame="_blank" w:history="1">
         <w:r>
           <w:rPr>
             <w:rFonts w:ascii="Arial" w:eastAsia="Times New Roman" w:hAnsi="Arial" w:cs="Arial"/>
@@ -8223,73 +10948,6 @@
         </w:rPr>
         <w:t xml:space="preserve">…” (major national coverage). </w:t>
       </w:r>
-      <w:hyperlink r:id="rId30" w:tgtFrame="_blank" w:history="1">
-        <w:r>
-          <w:rPr>
-            <w:rStyle w:val="max-w-15ch"/>
-            <w:rFonts w:ascii="Arial" w:eastAsiaTheme="majorEastAsia" w:hAnsi="Arial" w:cs="Arial"/>
-            <w:color w:val="0000FF"/>
-            <w:u w:val="single"/>
-          </w:rPr>
-          <w:t>The Guardian</w:t>
-        </w:r>
-      </w:hyperlink>
-    </w:p>
-    <w:p>
-      <w:pPr>
-        <w:pStyle w:val="NormalWeb"/>
-        <w:numPr>
-          <w:ilvl w:val="0"/>
-          <w:numId w:val="11"/>
-        </w:numPr>
-        <w:rPr>
-          <w:rFonts w:ascii="Arial" w:hAnsi="Arial" w:cs="Arial"/>
-        </w:rPr>
-      </w:pPr>
-      <w:r>
-        <w:rPr>
-          <w:rFonts w:ascii="Arial" w:hAnsi="Arial" w:cs="Arial"/>
-        </w:rPr>
-        <w:t xml:space="preserve">  </w:t>
-      </w:r>
-      <w:r>
-        <w:rPr>
-          <w:rStyle w:val="Strong"/>
-          <w:rFonts w:ascii="Arial" w:eastAsiaTheme="majorEastAsia" w:hAnsi="Arial" w:cs="Arial"/>
-        </w:rPr>
-        <w:t>Beach water-quality impacts around the 2012 season</w:t>
-      </w:r>
-    </w:p>
-    <w:p>
-      <w:pPr>
-        <w:pStyle w:val="NormalWeb"/>
-        <w:numPr>
-          <w:ilvl w:val="0"/>
-          <w:numId w:val="11"/>
-        </w:numPr>
-        <w:rPr>
-          <w:rFonts w:ascii="Arial" w:hAnsi="Arial" w:cs="Arial"/>
-        </w:rPr>
-      </w:pPr>
-      <w:r>
-        <w:rPr>
-          <w:rFonts w:ascii="Arial" w:hAnsi="Arial" w:cs="Arial"/>
-        </w:rPr>
-        <w:t xml:space="preserve">“Heavy recent rains are </w:t>
-      </w:r>
-      <w:r>
-        <w:rPr>
-          <w:rStyle w:val="Strong"/>
-          <w:rFonts w:ascii="Arial" w:eastAsiaTheme="majorEastAsia" w:hAnsi="Arial" w:cs="Arial"/>
-        </w:rPr>
-        <w:t>flushing raw sewage into coastal waters</w:t>
-      </w:r>
-      <w:r>
-        <w:rPr>
-          <w:rFonts w:ascii="Arial" w:hAnsi="Arial" w:cs="Arial"/>
-        </w:rPr>
-        <w:t xml:space="preserve">, ruining water quality at popular beaches…” (MCS quoted). </w:t>
-      </w:r>
       <w:hyperlink r:id="rId31" w:tgtFrame="_blank" w:history="1">
         <w:r>
           <w:rPr>
@@ -8301,38 +10959,61 @@
           <w:t>The Guardian</w:t>
         </w:r>
       </w:hyperlink>
-      <w:r>
-        <w:rPr>
-          <w:rFonts w:ascii="Arial" w:hAnsi="Arial" w:cs="Arial"/>
-        </w:rPr>
-        <w:br/>
-        <w:t xml:space="preserve">“Number of UK beaches </w:t>
+    </w:p>
+    <w:p>
+      <w:pPr>
+        <w:pStyle w:val="NormalWeb"/>
+        <w:numPr>
+          <w:ilvl w:val="0"/>
+          <w:numId w:val="11"/>
+        </w:numPr>
+        <w:rPr>
+          <w:rFonts w:ascii="Arial" w:hAnsi="Arial" w:cs="Arial"/>
+        </w:rPr>
+      </w:pPr>
+      <w:r>
+        <w:rPr>
+          <w:rFonts w:ascii="Arial" w:hAnsi="Arial" w:cs="Arial"/>
+        </w:rPr>
+        <w:t xml:space="preserve">  </w:t>
       </w:r>
       <w:r>
         <w:rPr>
           <w:rStyle w:val="Strong"/>
           <w:rFonts w:ascii="Arial" w:eastAsiaTheme="majorEastAsia" w:hAnsi="Arial" w:cs="Arial"/>
         </w:rPr>
-        <w:t>failing minimum standards</w:t>
-      </w:r>
-      <w:r>
-        <w:rPr>
-          <w:rFonts w:ascii="Arial" w:hAnsi="Arial" w:cs="Arial"/>
-        </w:rPr>
-        <w:t xml:space="preserve">… rose after the </w:t>
+        <w:t>Beach water-quality impacts around the 2012 season</w:t>
+      </w:r>
+    </w:p>
+    <w:p>
+      <w:pPr>
+        <w:pStyle w:val="NormalWeb"/>
+        <w:numPr>
+          <w:ilvl w:val="0"/>
+          <w:numId w:val="11"/>
+        </w:numPr>
+        <w:rPr>
+          <w:rFonts w:ascii="Arial" w:hAnsi="Arial" w:cs="Arial"/>
+        </w:rPr>
+      </w:pPr>
+      <w:r>
+        <w:rPr>
+          <w:rFonts w:ascii="Arial" w:hAnsi="Arial" w:cs="Arial"/>
+        </w:rPr>
+        <w:t xml:space="preserve">“Heavy recent rains are </w:t>
       </w:r>
       <w:r>
         <w:rPr>
           <w:rStyle w:val="Strong"/>
           <w:rFonts w:ascii="Arial" w:eastAsiaTheme="majorEastAsia" w:hAnsi="Arial" w:cs="Arial"/>
         </w:rPr>
-        <w:t>wet 2012</w:t>
-      </w:r>
-      <w:r>
-        <w:rPr>
-          <w:rFonts w:ascii="Arial" w:hAnsi="Arial" w:cs="Arial"/>
-        </w:rPr>
-        <w:t xml:space="preserve"> summer.” </w:t>
+        <w:t>flushing raw sewage into coastal waters</w:t>
+      </w:r>
+      <w:r>
+        <w:rPr>
+          <w:rFonts w:ascii="Arial" w:hAnsi="Arial" w:cs="Arial"/>
+        </w:rPr>
+        <w:t xml:space="preserve">, ruining water quality at popular beaches…” (MCS quoted). </w:t>
       </w:r>
       <w:hyperlink r:id="rId32" w:tgtFrame="_blank" w:history="1">
         <w:r>
@@ -8345,6 +11026,50 @@
           <w:t>The Guardian</w:t>
         </w:r>
       </w:hyperlink>
+      <w:r>
+        <w:rPr>
+          <w:rFonts w:ascii="Arial" w:hAnsi="Arial" w:cs="Arial"/>
+        </w:rPr>
+        <w:br/>
+        <w:t xml:space="preserve">“Number of UK beaches </w:t>
+      </w:r>
+      <w:r>
+        <w:rPr>
+          <w:rStyle w:val="Strong"/>
+          <w:rFonts w:ascii="Arial" w:eastAsiaTheme="majorEastAsia" w:hAnsi="Arial" w:cs="Arial"/>
+        </w:rPr>
+        <w:t>failing minimum standards</w:t>
+      </w:r>
+      <w:r>
+        <w:rPr>
+          <w:rFonts w:ascii="Arial" w:hAnsi="Arial" w:cs="Arial"/>
+        </w:rPr>
+        <w:t xml:space="preserve">… rose after the </w:t>
+      </w:r>
+      <w:r>
+        <w:rPr>
+          <w:rStyle w:val="Strong"/>
+          <w:rFonts w:ascii="Arial" w:eastAsiaTheme="majorEastAsia" w:hAnsi="Arial" w:cs="Arial"/>
+        </w:rPr>
+        <w:t>wet 2012</w:t>
+      </w:r>
+      <w:r>
+        <w:rPr>
+          <w:rFonts w:ascii="Arial" w:hAnsi="Arial" w:cs="Arial"/>
+        </w:rPr>
+        <w:t xml:space="preserve"> summer.” </w:t>
+      </w:r>
+      <w:hyperlink r:id="rId33" w:tgtFrame="_blank" w:history="1">
+        <w:r>
+          <w:rPr>
+            <w:rStyle w:val="max-w-15ch"/>
+            <w:rFonts w:ascii="Arial" w:eastAsiaTheme="majorEastAsia" w:hAnsi="Arial" w:cs="Arial"/>
+            <w:color w:val="0000FF"/>
+            <w:u w:val="single"/>
+          </w:rPr>
+          <w:t>The Guardian</w:t>
+        </w:r>
+      </w:hyperlink>
     </w:p>
     <w:p>
       <w:pPr>
@@ -8377,7 +11102,7 @@
         <w:br/>
         <w:t xml:space="preserve">Campaign and judgment coverage tying sewage pollution to a specific bathing beach. </w:t>
       </w:r>
-      <w:hyperlink r:id="rId33" w:tgtFrame="_blank" w:history="1">
+      <w:hyperlink r:id="rId34" w:tgtFrame="_blank" w:history="1">
         <w:r>
           <w:rPr>
             <w:rStyle w:val="max-w-15ch"/>
@@ -8552,6 +11277,7 @@
       </w:pPr>
     </w:p>
     <w:sectPr>
+      <w:type w:val="continuous"/>
       <w:pgSz w:w="11906" w:h="16838"/>
       <w:pgMar w:top="1440" w:right="1440" w:bottom="1440" w:left="1440" w:header="708" w:footer="708" w:gutter="0"/>
       <w:cols w:space="708"/>
@@ -10054,6 +12780,96 @@
     </w:lvl>
   </w:abstractNum>
   <w:abstractNum w:abstractNumId="10" w15:restartNumberingAfterBreak="0">
+    <w:nsid w:val="351222E9"/>
+    <w:multiLevelType w:val="hybridMultilevel"/>
+    <w:tmpl w:val="479C8442"/>
+    <w:lvl w:ilvl="0" w:tplc="FA461306">
+      <w:start w:val="1"/>
+      <w:numFmt w:val="upperLetter"/>
+      <w:lvlText w:val="%1."/>
+      <w:lvlJc w:val="left"/>
+      <w:pPr>
+        <w:ind w:left="720" w:hanging="360"/>
+      </w:pPr>
+      <w:rPr>
+        <w:rFonts w:hint="default"/>
+        <w:b/>
+      </w:rPr>
+    </w:lvl>
+    <w:lvl w:ilvl="1" w:tplc="08090019" w:tentative="1">
+      <w:start w:val="1"/>
+      <w:numFmt w:val="lowerLetter"/>
+      <w:lvlText w:val="%2."/>
+      <w:lvlJc w:val="left"/>
+      <w:pPr>
+        <w:ind w:left="1440" w:hanging="360"/>
+      </w:pPr>
+    </w:lvl>
+    <w:lvl w:ilvl="2" w:tplc="0809001B" w:tentative="1">
+      <w:start w:val="1"/>
+      <w:numFmt w:val="lowerRoman"/>
+      <w:lvlText w:val="%3."/>
+      <w:lvlJc w:val="right"/>
+      <w:pPr>
+        <w:ind w:left="2160" w:hanging="180"/>
+      </w:pPr>
+    </w:lvl>
+    <w:lvl w:ilvl="3" w:tplc="0809000F" w:tentative="1">
+      <w:start w:val="1"/>
+      <w:numFmt w:val="decimal"/>
+      <w:lvlText w:val="%4."/>
+      <w:lvlJc w:val="left"/>
+      <w:pPr>
+        <w:ind w:left="2880" w:hanging="360"/>
+      </w:pPr>
+    </w:lvl>
+    <w:lvl w:ilvl="4" w:tplc="08090019" w:tentative="1">
+      <w:start w:val="1"/>
+      <w:numFmt w:val="lowerLetter"/>
+      <w:lvlText w:val="%5."/>
+      <w:lvlJc w:val="left"/>
+      <w:pPr>
+        <w:ind w:left="3600" w:hanging="360"/>
+      </w:pPr>
+    </w:lvl>
+    <w:lvl w:ilvl="5" w:tplc="0809001B" w:tentative="1">
+      <w:start w:val="1"/>
+      <w:numFmt w:val="lowerRoman"/>
+      <w:lvlText w:val="%6."/>
+      <w:lvlJc w:val="right"/>
+      <w:pPr>
+        <w:ind w:left="4320" w:hanging="180"/>
+      </w:pPr>
+    </w:lvl>
+    <w:lvl w:ilvl="6" w:tplc="0809000F" w:tentative="1">
+      <w:start w:val="1"/>
+      <w:numFmt w:val="decimal"/>
+      <w:lvlText w:val="%7."/>
+      <w:lvlJc w:val="left"/>
+      <w:pPr>
+        <w:ind w:left="5040" w:hanging="360"/>
+      </w:pPr>
+    </w:lvl>
+    <w:lvl w:ilvl="7" w:tplc="08090019" w:tentative="1">
+      <w:start w:val="1"/>
+      <w:numFmt w:val="lowerLetter"/>
+      <w:lvlText w:val="%8."/>
+      <w:lvlJc w:val="left"/>
+      <w:pPr>
+        <w:ind w:left="5760" w:hanging="360"/>
+      </w:pPr>
+    </w:lvl>
+    <w:lvl w:ilvl="8" w:tplc="0809001B" w:tentative="1">
+      <w:start w:val="1"/>
+      <w:numFmt w:val="lowerRoman"/>
+      <w:lvlText w:val="%9."/>
+      <w:lvlJc w:val="right"/>
+      <w:pPr>
+        <w:ind w:left="6480" w:hanging="180"/>
+      </w:pPr>
+    </w:lvl>
+  </w:abstractNum>
+  <w:abstractNum w:abstractNumId="11" w15:restartNumberingAfterBreak="0">
     <w:nsid w:val="35B10745"/>
     <w:multiLevelType w:val="multilevel"/>
     <w:tmpl w:val="2278B52E"/>
@@ -10202,7 +13018,7 @@
       </w:rPr>
     </w:lvl>
   </w:abstractNum>
-  <w:abstractNum w:abstractNumId="11" w15:restartNumberingAfterBreak="0">
+  <w:abstractNum w:abstractNumId="12" w15:restartNumberingAfterBreak="0">
     <w:nsid w:val="406E1059"/>
     <w:multiLevelType w:val="multilevel"/>
     <w:tmpl w:val="B218B36C"/>
@@ -10351,7 +13167,7 @@
       </w:rPr>
     </w:lvl>
   </w:abstractNum>
-  <w:abstractNum w:abstractNumId="12" w15:restartNumberingAfterBreak="0">
+  <w:abstractNum w:abstractNumId="13" w15:restartNumberingAfterBreak="0">
     <w:nsid w:val="42EB7EB1"/>
     <w:multiLevelType w:val="multilevel"/>
     <w:tmpl w:val="587C273C"/>
@@ -10500,7 +13316,7 @@
       </w:rPr>
     </w:lvl>
   </w:abstractNum>
-  <w:abstractNum w:abstractNumId="13" w15:restartNumberingAfterBreak="0">
+  <w:abstractNum w:abstractNumId="14" w15:restartNumberingAfterBreak="0">
     <w:nsid w:val="53AA77A2"/>
     <w:multiLevelType w:val="multilevel"/>
     <w:tmpl w:val="9FB0D210"/>
@@ -10649,7 +13465,186 @@
       </w:rPr>
     </w:lvl>
   </w:abstractNum>
-  <w:abstractNum w:abstractNumId="14" w15:restartNumberingAfterBreak="0">
+  <w:abstractNum w:abstractNumId="15" w15:restartNumberingAfterBreak="0">
+    <w:nsid w:val="54CA22AD"/>
+    <w:multiLevelType w:val="hybridMultilevel"/>
+    <w:tmpl w:val="A5CAD33A"/>
+    <w:lvl w:ilvl="0" w:tplc="0809000F">
+      <w:start w:val="1"/>
+      <w:numFmt w:val="decimal"/>
+      <w:lvlText w:val="%1."/>
+      <w:lvlJc w:val="left"/>
+      <w:pPr>
+        <w:ind w:left="720" w:hanging="360"/>
+      </w:pPr>
+      <w:rPr>
+        <w:rFonts w:hint="default"/>
+      </w:rPr>
+    </w:lvl>
+    <w:lvl w:ilvl="1" w:tplc="08090019" w:tentative="1">
+      <w:start w:val="1"/>
+      <w:numFmt w:val="lowerLetter"/>
+      <w:lvlText w:val="%2."/>
+      <w:lvlJc w:val="left"/>
+      <w:pPr>
+        <w:ind w:left="1440" w:hanging="360"/>
+      </w:pPr>
+    </w:lvl>
+    <w:lvl w:ilvl="2" w:tplc="0809001B" w:tentative="1">
+      <w:start w:val="1"/>
+      <w:numFmt w:val="lowerRoman"/>
+      <w:lvlText w:val="%3."/>
+      <w:lvlJc w:val="right"/>
+      <w:pPr>
+        <w:ind w:left="2160" w:hanging="180"/>
+      </w:pPr>
+    </w:lvl>
+    <w:lvl w:ilvl="3" w:tplc="0809000F" w:tentative="1">
+      <w:start w:val="1"/>
+      <w:numFmt w:val="decimal"/>
+      <w:lvlText w:val="%4."/>
+      <w:lvlJc w:val="left"/>
+      <w:pPr>
+        <w:ind w:left="2880" w:hanging="360"/>
+      </w:pPr>
+    </w:lvl>
+    <w:lvl w:ilvl="4" w:tplc="08090019" w:tentative="1">
+      <w:start w:val="1"/>
+      <w:numFmt w:val="lowerLetter"/>
+      <w:lvlText w:val="%5."/>
+      <w:lvlJc w:val="left"/>
+      <w:pPr>
+        <w:ind w:left="3600" w:hanging="360"/>
+      </w:pPr>
+    </w:lvl>
+    <w:lvl w:ilvl="5" w:tplc="0809001B" w:tentative="1">
+      <w:start w:val="1"/>
+      <w:numFmt w:val="lowerRoman"/>
+      <w:lvlText w:val="%6."/>
+      <w:lvlJc w:val="right"/>
+      <w:pPr>
+        <w:ind w:left="4320" w:hanging="180"/>
+      </w:pPr>
+    </w:lvl>
+    <w:lvl w:ilvl="6" w:tplc="0809000F" w:tentative="1">
+      <w:start w:val="1"/>
+      <w:numFmt w:val="decimal"/>
+      <w:lvlText w:val="%7."/>
+      <w:lvlJc w:val="left"/>
+      <w:pPr>
+        <w:ind w:left="5040" w:hanging="360"/>
+      </w:pPr>
+    </w:lvl>
+    <w:lvl w:ilvl="7" w:tplc="08090019" w:tentative="1">
+      <w:start w:val="1"/>
+      <w:numFmt w:val="lowerLetter"/>
+      <w:lvlText w:val="%8."/>
+      <w:lvlJc w:val="left"/>
+      <w:pPr>
+        <w:ind w:left="5760" w:hanging="360"/>
+      </w:pPr>
+    </w:lvl>
+    <w:lvl w:ilvl="8" w:tplc="0809001B" w:tentative="1">
+      <w:start w:val="1"/>
+      <w:numFmt w:val="lowerRoman"/>
+      <w:lvlText w:val="%9."/>
+      <w:lvlJc w:val="right"/>
+      <w:pPr>
+        <w:ind w:left="6480" w:hanging="180"/>
+      </w:pPr>
+    </w:lvl>
+  </w:abstractNum>
+  <w:abstractNum w:abstractNumId="16" w15:restartNumberingAfterBreak="0">
+    <w:nsid w:val="56AA00E6"/>
+    <w:multiLevelType w:val="hybridMultilevel"/>
+    <w:tmpl w:val="1EDE7786"/>
+    <w:lvl w:ilvl="0" w:tplc="FCCE2A9C">
+      <w:start w:val="1"/>
+      <w:numFmt w:val="decimal"/>
+      <w:lvlText w:val="%1."/>
+      <w:lvlJc w:val="left"/>
+      <w:pPr>
+        <w:ind w:left="720" w:hanging="360"/>
+      </w:pPr>
+      <w:rPr>
+        <w:rFonts w:hint="default"/>
+        <w:b/>
+      </w:rPr>
+    </w:lvl>
+    <w:lvl w:ilvl="1" w:tplc="08090019" w:tentative="1">
+      <w:start w:val="1"/>
+      <w:numFmt w:val="lowerLetter"/>
+      <w:lvlText w:val="%2."/>
+      <w:lvlJc w:val="left"/>
+      <w:pPr>
+        <w:ind w:left="1440" w:hanging="360"/>
+      </w:pPr>
+    </w:lvl>
+    <w:lvl w:ilvl="2" w:tplc="0809001B" w:tentative="1">
+      <w:start w:val="1"/>
+      <w:numFmt w:val="lowerRoman"/>
+      <w:lvlText w:val="%3."/>
+      <w:lvlJc w:val="right"/>
+      <w:pPr>
+        <w:ind w:left="2160" w:hanging="180"/>
+      </w:pPr>
+    </w:lvl>
+    <w:lvl w:ilvl="3" w:tplc="0809000F" w:tentative="1">
+      <w:start w:val="1"/>
+      <w:numFmt w:val="decimal"/>
+      <w:lvlText w:val="%4."/>
+      <w:lvlJc w:val="left"/>
+      <w:pPr>
+        <w:ind w:left="2880" w:hanging="360"/>
+      </w:pPr>
+    </w:lvl>
+    <w:lvl w:ilvl="4" w:tplc="08090019" w:tentative="1">
+      <w:start w:val="1"/>
+      <w:numFmt w:val="lowerLetter"/>
+      <w:lvlText w:val="%5."/>
+      <w:lvlJc w:val="left"/>
+      <w:pPr>
+        <w:ind w:left="3600" w:hanging="360"/>
+      </w:pPr>
+    </w:lvl>
+    <w:lvl w:ilvl="5" w:tplc="0809001B" w:tentative="1">
+      <w:start w:val="1"/>
+      <w:numFmt w:val="lowerRoman"/>
+      <w:lvlText w:val="%6."/>
+      <w:lvlJc w:val="right"/>
+      <w:pPr>
+        <w:ind w:left="4320" w:hanging="180"/>
+      </w:pPr>
+    </w:lvl>
+    <w:lvl w:ilvl="6" w:tplc="0809000F" w:tentative="1">
+      <w:start w:val="1"/>
+      <w:numFmt w:val="decimal"/>
+      <w:lvlText w:val="%7."/>
+      <w:lvlJc w:val="left"/>
+      <w:pPr>
+        <w:ind w:left="5040" w:hanging="360"/>
+      </w:pPr>
+    </w:lvl>
+    <w:lvl w:ilvl="7" w:tplc="08090019" w:tentative="1">
+      <w:start w:val="1"/>
+      <w:numFmt w:val="lowerLetter"/>
+      <w:lvlText w:val="%8."/>
+      <w:lvlJc w:val="left"/>
+      <w:pPr>
+        <w:ind w:left="5760" w:hanging="360"/>
+      </w:pPr>
+    </w:lvl>
+    <w:lvl w:ilvl="8" w:tplc="0809001B" w:tentative="1">
+      <w:start w:val="1"/>
+      <w:numFmt w:val="lowerRoman"/>
+      <w:lvlText w:val="%9."/>
+      <w:lvlJc w:val="right"/>
+      <w:pPr>
+        <w:ind w:left="6480" w:hanging="180"/>
+      </w:pPr>
+    </w:lvl>
+  </w:abstractNum>
+  <w:abstractNum w:abstractNumId="17" w15:restartNumberingAfterBreak="0">
     <w:nsid w:val="56DD2CA4"/>
     <w:multiLevelType w:val="multilevel"/>
     <w:tmpl w:val="A614E24E"/>
@@ -10798,7 +13793,7 @@
       </w:rPr>
     </w:lvl>
   </w:abstractNum>
-  <w:abstractNum w:abstractNumId="15" w15:restartNumberingAfterBreak="0">
+  <w:abstractNum w:abstractNumId="18" w15:restartNumberingAfterBreak="0">
     <w:nsid w:val="572D3496"/>
     <w:multiLevelType w:val="multilevel"/>
     <w:tmpl w:val="3E5A67F2"/>
@@ -10947,7 +13942,7 @@
       </w:rPr>
     </w:lvl>
   </w:abstractNum>
-  <w:abstractNum w:abstractNumId="16" w15:restartNumberingAfterBreak="0">
+  <w:abstractNum w:abstractNumId="19" w15:restartNumberingAfterBreak="0">
     <w:nsid w:val="5B366BD4"/>
     <w:multiLevelType w:val="multilevel"/>
     <w:tmpl w:val="084A4548"/>
@@ -11096,7 +14091,7 @@
       </w:rPr>
     </w:lvl>
   </w:abstractNum>
-  <w:abstractNum w:abstractNumId="17" w15:restartNumberingAfterBreak="0">
+  <w:abstractNum w:abstractNumId="20" w15:restartNumberingAfterBreak="0">
     <w:nsid w:val="60FC61FD"/>
     <w:multiLevelType w:val="multilevel"/>
     <w:tmpl w:val="081C898C"/>
@@ -11243,6 +14238,119 @@
         <w:rFonts w:ascii="Wingdings" w:hAnsi="Wingdings" w:hint="default"/>
         <w:sz w:val="20"/>
       </w:rPr>
+    </w:lvl>
+  </w:abstractNum>
+  <w:abstractNum w:abstractNumId="21" w15:restartNumberingAfterBreak="0">
+    <w:nsid w:val="619D0455"/>
+    <w:multiLevelType w:val="multilevel"/>
+    <w:tmpl w:val="A630FC82"/>
+    <w:lvl w:ilvl="0">
+      <w:start w:val="1"/>
+      <w:numFmt w:val="decimal"/>
+      <w:lvlText w:val="%1."/>
+      <w:lvlJc w:val="left"/>
+      <w:pPr>
+        <w:tabs>
+          <w:tab w:val="num" w:pos="720"/>
+        </w:tabs>
+        <w:ind w:left="720" w:hanging="360"/>
+      </w:pPr>
+    </w:lvl>
+    <w:lvl w:ilvl="1" w:tentative="1">
+      <w:start w:val="1"/>
+      <w:numFmt w:val="decimal"/>
+      <w:lvlText w:val="%2."/>
+      <w:lvlJc w:val="left"/>
+      <w:pPr>
+        <w:tabs>
+          <w:tab w:val="num" w:pos="1440"/>
+        </w:tabs>
+        <w:ind w:left="1440" w:hanging="360"/>
+      </w:pPr>
+    </w:lvl>
+    <w:lvl w:ilvl="2" w:tentative="1">
+      <w:start w:val="1"/>
+      <w:numFmt w:val="decimal"/>
+      <w:lvlText w:val="%3."/>
+      <w:lvlJc w:val="left"/>
+      <w:pPr>
+        <w:tabs>
+          <w:tab w:val="num" w:pos="2160"/>
+        </w:tabs>
+        <w:ind w:left="2160" w:hanging="360"/>
+      </w:pPr>
+    </w:lvl>
+    <w:lvl w:ilvl="3" w:tentative="1">
+      <w:start w:val="1"/>
+      <w:numFmt w:val="decimal"/>
+      <w:lvlText w:val="%4."/>
+      <w:lvlJc w:val="left"/>
+      <w:pPr>
+        <w:tabs>
+          <w:tab w:val="num" w:pos="2880"/>
+        </w:tabs>
+        <w:ind w:left="2880" w:hanging="360"/>
+      </w:pPr>
+    </w:lvl>
+    <w:lvl w:ilvl="4" w:tentative="1">
+      <w:start w:val="1"/>
+      <w:numFmt w:val="decimal"/>
+      <w:lvlText w:val="%5."/>
+      <w:lvlJc w:val="left"/>
+      <w:pPr>
+        <w:tabs>
+          <w:tab w:val="num" w:pos="3600"/>
+        </w:tabs>
+        <w:ind w:left="3600" w:hanging="360"/>
+      </w:pPr>
+    </w:lvl>
+    <w:lvl w:ilvl="5" w:tentative="1">
+      <w:start w:val="1"/>
+      <w:numFmt w:val="decimal"/>
+      <w:lvlText w:val="%6."/>
+      <w:lvlJc w:val="left"/>
+      <w:pPr>
+        <w:tabs>
+          <w:tab w:val="num" w:pos="4320"/>
+        </w:tabs>
+        <w:ind w:left="4320" w:hanging="360"/>
+      </w:pPr>
+    </w:lvl>
+    <w:lvl w:ilvl="6" w:tentative="1">
+      <w:start w:val="1"/>
+      <w:numFmt w:val="decimal"/>
+      <w:lvlText w:val="%7."/>
+      <w:lvlJc w:val="left"/>
+      <w:pPr>
+        <w:tabs>
+          <w:tab w:val="num" w:pos="5040"/>
+        </w:tabs>
+        <w:ind w:left="5040" w:hanging="360"/>
+      </w:pPr>
+    </w:lvl>
+    <w:lvl w:ilvl="7" w:tentative="1">
+      <w:start w:val="1"/>
+      <w:numFmt w:val="decimal"/>
+      <w:lvlText w:val="%8."/>
+      <w:lvlJc w:val="left"/>
+      <w:pPr>
+        <w:tabs>
+          <w:tab w:val="num" w:pos="5760"/>
+        </w:tabs>
+        <w:ind w:left="5760" w:hanging="360"/>
+      </w:pPr>
+    </w:lvl>
+    <w:lvl w:ilvl="8" w:tentative="1">
+      <w:start w:val="1"/>
+      <w:numFmt w:val="decimal"/>
+      <w:lvlText w:val="%9."/>
+      <w:lvlJc w:val="left"/>
+      <w:pPr>
+        <w:tabs>
+          <w:tab w:val="num" w:pos="6480"/>
+        </w:tabs>
+        <w:ind w:left="6480" w:hanging="360"/>
+      </w:pPr>
     </w:lvl>
   </w:abstractNum>
   <w:num w:numId="1" w16cid:durableId="802116958">
@@ -11255,16 +14363,16 @@
     <w:abstractNumId w:val="1"/>
   </w:num>
   <w:num w:numId="4" w16cid:durableId="538326098">
-    <w:abstractNumId w:val="15"/>
+    <w:abstractNumId w:val="18"/>
   </w:num>
   <w:num w:numId="5" w16cid:durableId="262497613">
     <w:abstractNumId w:val="8"/>
   </w:num>
   <w:num w:numId="6" w16cid:durableId="1090933213">
-    <w:abstractNumId w:val="12"/>
+    <w:abstractNumId w:val="13"/>
   </w:num>
   <w:num w:numId="7" w16cid:durableId="1368868889">
-    <w:abstractNumId w:val="11"/>
+    <w:abstractNumId w:val="12"/>
   </w:num>
   <w:num w:numId="8" w16cid:durableId="2085640275">
     <w:abstractNumId w:val="0"/>
@@ -11273,7 +14381,7 @@
     <w:abstractNumId w:val="4"/>
   </w:num>
   <w:num w:numId="10" w16cid:durableId="544218511">
-    <w:abstractNumId w:val="13"/>
+    <w:abstractNumId w:val="14"/>
   </w:num>
   <w:num w:numId="11" w16cid:durableId="1191645582">
     <w:abstractNumId w:val="9"/>
@@ -11282,22 +14390,34 @@
     <w:abstractNumId w:val="3"/>
   </w:num>
   <w:num w:numId="13" w16cid:durableId="1004743577">
-    <w:abstractNumId w:val="14"/>
+    <w:abstractNumId w:val="17"/>
   </w:num>
   <w:num w:numId="14" w16cid:durableId="776752837">
-    <w:abstractNumId w:val="10"/>
+    <w:abstractNumId w:val="11"/>
   </w:num>
   <w:num w:numId="15" w16cid:durableId="709721483">
-    <w:abstractNumId w:val="17"/>
+    <w:abstractNumId w:val="20"/>
   </w:num>
   <w:num w:numId="16" w16cid:durableId="946158986">
-    <w:abstractNumId w:val="16"/>
+    <w:abstractNumId w:val="19"/>
   </w:num>
   <w:num w:numId="17" w16cid:durableId="1062758057">
     <w:abstractNumId w:val="2"/>
   </w:num>
   <w:num w:numId="18" w16cid:durableId="700014804">
     <w:abstractNumId w:val="6"/>
+  </w:num>
+  <w:num w:numId="19" w16cid:durableId="1318338345">
+    <w:abstractNumId w:val="15"/>
+  </w:num>
+  <w:num w:numId="20" w16cid:durableId="1264730038">
+    <w:abstractNumId w:val="21"/>
+  </w:num>
+  <w:num w:numId="21" w16cid:durableId="819224278">
+    <w:abstractNumId w:val="10"/>
+  </w:num>
+  <w:num w:numId="22" w16cid:durableId="919827143">
+    <w:abstractNumId w:val="16"/>
   </w:num>
 </w:numbering>
 </file>
@@ -12286,6 +15406,33 @@
       <w:shd w:val="clear" w:color="auto" w:fill="E1DFDD"/>
     </w:rPr>
   </w:style>
+  <w:style w:type="paragraph" w:customStyle="1" w:styleId="ds-markdown-paragraph">
+    <w:name w:val="ds-markdown-paragraph"/>
+    <w:basedOn w:val="Normal"/>
+    <w:rsid w:val="005B67C3"/>
+    <w:pPr>
+      <w:spacing w:before="100" w:beforeAutospacing="1" w:after="100" w:afterAutospacing="1"/>
+    </w:pPr>
+    <w:rPr>
+      <w:rFonts w:ascii="Times New Roman" w:eastAsia="Times New Roman" w:hAnsi="Times New Roman" w:cs="Times New Roman"/>
+      <w:kern w:val="0"/>
+      <w:lang w:eastAsia="en-GB"/>
+      <w14:ligatures w14:val="none"/>
+    </w:rPr>
+  </w:style>
+  <w:style w:type="character" w:styleId="HTMLCode">
+    <w:name w:val="HTML Code"/>
+    <w:basedOn w:val="DefaultParagraphFont"/>
+    <w:uiPriority w:val="99"/>
+    <w:semiHidden/>
+    <w:unhideWhenUsed/>
+    <w:rsid w:val="005B67C3"/>
+    <w:rPr>
+      <w:rFonts w:ascii="Courier New" w:eastAsia="Times New Roman" w:hAnsi="Courier New" w:cs="Courier New"/>
+      <w:sz w:val="20"/>
+      <w:szCs w:val="20"/>
+    </w:rPr>
+  </w:style>
 </w:styles>
 </file>
 

</xml_diff>